<commit_message>
Footnote every factual claim in the ICC essay
Gives each factual sentence its own citation instead of relying on a
note at the end of a passage, adds sources for the 2019 Kashmir order,
the ICJ plan being dropped, the 2023 UPR dates and States Parties status.

Co-Authored-By: Claude Opus 5.5 <noreply@anthropic.com>
Claude-Session: https://claude.ai/code/session_01Cr2GVEMwb3utb44Fft5d3o
</commit_message>
<xml_diff>
--- a/Pakistans_Attitude_Towards_the_ICC_footnoted.docx
+++ b/Pakistans_Attitude_Towards_the_ICC_footnoted.docx
@@ -29,7 +29,25 @@
           <w:sz w:val="24"/>
           <w:szCs w:val="24"/>
         </w:rPr>
-        <w:t xml:space="preserve">Pakistan is not a State Party to the Rome Statute of the International Criminal Court (ICC). This does not mean that Pakistan is simply hostile to the Court. It voted for the Statute in 1998 but never signed it. It rejects the Court's jurisdiction over itself, yet its leaders regularly invoke the Court against India and Israel. Its government has made no preparations to join, yet its own National Assembly has hosted an international conference promoting ratification. This essay traces Pakistan's relationship with the Court chronologically, from the Rome Conference in 1998 to the present day, in order to answer four questions: what Pakistan's current attitude towards the ICC is, whether it is preparing to join, what it objects to, and who supports the Court inside Pakistan.</w:t>
+        <w:t xml:space="preserve">Pakistan is not a State Party to the Rome Statute of the International Criminal Court (ICC).</w:t>
+      </w:r>
+      <w:r>
+        <w:rPr>
+          <w:rStyle w:val="FootnoteReference"/>
+          <w:rFonts w:ascii="Times New Roman" w:cs="Times New Roman" w:eastAsia="Times New Roman" w:hAnsi="Times New Roman"/>
+          <w:sz w:val="24"/>
+          <w:szCs w:val="24"/>
+          <w:vertAlign w:val="superscript"/>
+        </w:rPr>
+        <w:footnoteReference w:id="1"/>
+      </w:r>
+      <w:r>
+        <w:rPr>
+          <w:rFonts w:ascii="Times New Roman" w:cs="Times New Roman" w:eastAsia="Times New Roman" w:hAnsi="Times New Roman"/>
+          <w:sz w:val="24"/>
+          <w:szCs w:val="24"/>
+        </w:rPr>
+        <w:t xml:space="preserve"> This does not mean that Pakistan is simply hostile to the Court. It voted for the Statute in 1998 but never signed it. It rejects the Court's jurisdiction over itself, yet its leaders regularly invoke the Court against India and Israel. Its government has made no preparations to join, yet its own National Assembly has hosted an international conference promoting ratification. This essay traces Pakistan's relationship with the Court chronologically, from the Rome Conference in 1998 to the present day, in order to answer four questions: what Pakistan's current attitude towards the ICC is, whether it is preparing to join, what it objects to, and who supports the Court inside Pakistan.</w:t>
       </w:r>
     </w:p>
     <w:p>
@@ -69,7 +87,7 @@
           <w:szCs w:val="24"/>
           <w:vertAlign w:val="superscript"/>
         </w:rPr>
-        <w:footnoteReference w:id="1"/>
+        <w:footnoteReference w:id="2"/>
       </w:r>
       <w:r>
         <w:rPr>
@@ -87,25 +105,43 @@
           <w:szCs w:val="24"/>
           <w:vertAlign w:val="superscript"/>
         </w:rPr>
-        <w:footnoteReference w:id="2"/>
-      </w:r>
-      <w:r>
-        <w:rPr>
-          <w:rFonts w:ascii="Times New Roman" w:cs="Times New Roman" w:eastAsia="Times New Roman" w:hAnsi="Times New Roman"/>
-          <w:sz w:val="24"/>
-          <w:szCs w:val="24"/>
-        </w:rPr>
-        <w:t xml:space="preserve"> Pakistan's worry was that several provisions of the Statute could impinge on state sovereignty and weaken the principle of complementarity, the rule that the ICC acts only when national courts are unable or unwilling to do so. The Statute was open for signature until 31 December 2000, but Pakistan did not sign it, and when the Statute entered into force on 1 July 2002, Pakistan remained outside it.</w:t>
-      </w:r>
-      <w:r>
-        <w:rPr>
-          <w:rStyle w:val="FootnoteReference"/>
-          <w:rFonts w:ascii="Times New Roman" w:cs="Times New Roman" w:eastAsia="Times New Roman" w:hAnsi="Times New Roman"/>
-          <w:sz w:val="24"/>
-          <w:szCs w:val="24"/>
-          <w:vertAlign w:val="superscript"/>
-        </w:rPr>
         <w:footnoteReference w:id="3"/>
+      </w:r>
+      <w:r>
+        <w:rPr>
+          <w:rFonts w:ascii="Times New Roman" w:cs="Times New Roman" w:eastAsia="Times New Roman" w:hAnsi="Times New Roman"/>
+          <w:sz w:val="24"/>
+          <w:szCs w:val="24"/>
+        </w:rPr>
+        <w:t xml:space="preserve"> Pakistan's worry was that several provisions of the Statute could impinge on state sovereignty and weaken the principle of complementarity, the rule that the ICC acts only when national courts are unable or unwilling to do so.</w:t>
+      </w:r>
+      <w:r>
+        <w:rPr>
+          <w:rStyle w:val="FootnoteReference"/>
+          <w:rFonts w:ascii="Times New Roman" w:cs="Times New Roman" w:eastAsia="Times New Roman" w:hAnsi="Times New Roman"/>
+          <w:sz w:val="24"/>
+          <w:szCs w:val="24"/>
+          <w:vertAlign w:val="superscript"/>
+        </w:rPr>
+        <w:footnoteReference w:id="4"/>
+      </w:r>
+      <w:r>
+        <w:rPr>
+          <w:rFonts w:ascii="Times New Roman" w:cs="Times New Roman" w:eastAsia="Times New Roman" w:hAnsi="Times New Roman"/>
+          <w:sz w:val="24"/>
+          <w:szCs w:val="24"/>
+        </w:rPr>
+        <w:t xml:space="preserve"> The Statute was open for signature until 31 December 2000, but Pakistan did not sign it, and when the Statute entered into force on 1 July 2002, Pakistan remained outside it.</w:t>
+      </w:r>
+      <w:r>
+        <w:rPr>
+          <w:rStyle w:val="FootnoteReference"/>
+          <w:rFonts w:ascii="Times New Roman" w:cs="Times New Roman" w:eastAsia="Times New Roman" w:hAnsi="Times New Roman"/>
+          <w:sz w:val="24"/>
+          <w:szCs w:val="24"/>
+          <w:vertAlign w:val="superscript"/>
+        </w:rPr>
+        <w:footnoteReference w:id="5"/>
       </w:r>
     </w:p>
     <w:p>
@@ -129,7 +165,7 @@
           <w:szCs w:val="24"/>
           <w:vertAlign w:val="superscript"/>
         </w:rPr>
-        <w:footnoteReference w:id="4"/>
+        <w:footnoteReference w:id="6"/>
       </w:r>
     </w:p>
     <w:p>
@@ -164,7 +200,7 @@
           <w:szCs w:val="24"/>
           <w:vertAlign w:val="superscript"/>
         </w:rPr>
-        <w:footnoteReference w:id="5"/>
+        <w:footnoteReference w:id="7"/>
       </w:r>
       <w:r>
         <w:rPr>
@@ -182,7 +218,7 @@
           <w:szCs w:val="24"/>
           <w:vertAlign w:val="superscript"/>
         </w:rPr>
-        <w:footnoteReference w:id="6"/>
+        <w:footnoteReference w:id="8"/>
       </w:r>
       <w:r>
         <w:rPr>
@@ -191,6 +227,16 @@
           <w:szCs w:val="24"/>
         </w:rPr>
         <w:t xml:space="preserve"> Ratification would therefore create a direct constitutional conflict.</w:t>
+      </w:r>
+      <w:r>
+        <w:rPr>
+          <w:rStyle w:val="FootnoteReference"/>
+          <w:rFonts w:ascii="Times New Roman" w:cs="Times New Roman" w:eastAsia="Times New Roman" w:hAnsi="Times New Roman"/>
+          <w:sz w:val="24"/>
+          <w:szCs w:val="24"/>
+          <w:vertAlign w:val="superscript"/>
+        </w:rPr>
+        <w:footnoteReference w:id="9"/>
       </w:r>
     </w:p>
     <w:p>
@@ -225,7 +271,7 @@
           <w:szCs w:val="24"/>
           <w:vertAlign w:val="superscript"/>
         </w:rPr>
-        <w:footnoteReference w:id="7"/>
+        <w:footnoteReference w:id="10"/>
       </w:r>
     </w:p>
     <w:p>
@@ -250,17 +296,35 @@
           <w:sz w:val="24"/>
           <w:szCs w:val="24"/>
         </w:rPr>
-        <w:t xml:space="preserve"> The Security Council can refer situations to the Court (Article 13(b)) and pause investigations (Article 16). Pakistan sees these as political triggers controlled by the five permanent members.</w:t>
-      </w:r>
-      <w:r>
-        <w:rPr>
-          <w:rStyle w:val="FootnoteReference"/>
-          <w:rFonts w:ascii="Times New Roman" w:cs="Times New Roman" w:eastAsia="Times New Roman" w:hAnsi="Times New Roman"/>
-          <w:sz w:val="24"/>
-          <w:szCs w:val="24"/>
-          <w:vertAlign w:val="superscript"/>
-        </w:rPr>
-        <w:footnoteReference w:id="8"/>
+        <w:t xml:space="preserve"> The Security Council can refer situations to the Court (Article 13(b)) and pause investigations (Article 16).</w:t>
+      </w:r>
+      <w:r>
+        <w:rPr>
+          <w:rStyle w:val="FootnoteReference"/>
+          <w:rFonts w:ascii="Times New Roman" w:cs="Times New Roman" w:eastAsia="Times New Roman" w:hAnsi="Times New Roman"/>
+          <w:sz w:val="24"/>
+          <w:szCs w:val="24"/>
+          <w:vertAlign w:val="superscript"/>
+        </w:rPr>
+        <w:footnoteReference w:id="11"/>
+      </w:r>
+      <w:r>
+        <w:rPr>
+          <w:rFonts w:ascii="Times New Roman" w:cs="Times New Roman" w:eastAsia="Times New Roman" w:hAnsi="Times New Roman"/>
+          <w:sz w:val="24"/>
+          <w:szCs w:val="24"/>
+        </w:rPr>
+        <w:t xml:space="preserve"> Pakistan sees these as political triggers controlled by the five permanent members.</w:t>
+      </w:r>
+      <w:r>
+        <w:rPr>
+          <w:rStyle w:val="FootnoteReference"/>
+          <w:rFonts w:ascii="Times New Roman" w:cs="Times New Roman" w:eastAsia="Times New Roman" w:hAnsi="Times New Roman"/>
+          <w:sz w:val="24"/>
+          <w:szCs w:val="24"/>
+          <w:vertAlign w:val="superscript"/>
+        </w:rPr>
+        <w:footnoteReference w:id="12"/>
       </w:r>
     </w:p>
     <w:p>
@@ -285,17 +349,35 @@
           <w:sz w:val="24"/>
           <w:szCs w:val="24"/>
         </w:rPr>
-        <w:t xml:space="preserve"> Pakistan is one of the largest contributors of troops to UN peacekeeping missions. It fears its soldiers could face politically motivated prosecutions, including under the doctrine of command responsibility.</w:t>
-      </w:r>
-      <w:r>
-        <w:rPr>
-          <w:rStyle w:val="FootnoteReference"/>
-          <w:rFonts w:ascii="Times New Roman" w:cs="Times New Roman" w:eastAsia="Times New Roman" w:hAnsi="Times New Roman"/>
-          <w:sz w:val="24"/>
-          <w:szCs w:val="24"/>
-          <w:vertAlign w:val="superscript"/>
-        </w:rPr>
-        <w:footnoteReference w:id="9"/>
+        <w:t xml:space="preserve"> Pakistan is one of the largest contributors of troops to UN peacekeeping missions.</w:t>
+      </w:r>
+      <w:r>
+        <w:rPr>
+          <w:rStyle w:val="FootnoteReference"/>
+          <w:rFonts w:ascii="Times New Roman" w:cs="Times New Roman" w:eastAsia="Times New Roman" w:hAnsi="Times New Roman"/>
+          <w:sz w:val="24"/>
+          <w:szCs w:val="24"/>
+          <w:vertAlign w:val="superscript"/>
+        </w:rPr>
+        <w:footnoteReference w:id="13"/>
+      </w:r>
+      <w:r>
+        <w:rPr>
+          <w:rFonts w:ascii="Times New Roman" w:cs="Times New Roman" w:eastAsia="Times New Roman" w:hAnsi="Times New Roman"/>
+          <w:sz w:val="24"/>
+          <w:szCs w:val="24"/>
+        </w:rPr>
+        <w:t xml:space="preserve"> It fears its soldiers could face politically motivated prosecutions, including under the doctrine of command responsibility.</w:t>
+      </w:r>
+      <w:r>
+        <w:rPr>
+          <w:rStyle w:val="FootnoteReference"/>
+          <w:rFonts w:ascii="Times New Roman" w:cs="Times New Roman" w:eastAsia="Times New Roman" w:hAnsi="Times New Roman"/>
+          <w:sz w:val="24"/>
+          <w:szCs w:val="24"/>
+          <w:vertAlign w:val="superscript"/>
+        </w:rPr>
+        <w:footnoteReference w:id="14"/>
       </w:r>
     </w:p>
     <w:p>
@@ -319,15 +401,15 @@
           <w:szCs w:val="24"/>
           <w:vertAlign w:val="superscript"/>
         </w:rPr>
-        <w:footnoteReference w:id="10"/>
-      </w:r>
-      <w:r>
-        <w:rPr>
-          <w:rFonts w:ascii="Times New Roman" w:cs="Times New Roman" w:eastAsia="Times New Roman" w:hAnsi="Times New Roman"/>
-          <w:sz w:val="24"/>
-          <w:szCs w:val="24"/>
-        </w:rPr>
-        <w:t xml:space="preserve"> Military operations in the former tribal areas and Balochistan would also come under international scrutiny if Pakistan joined.</w:t>
+        <w:footnoteReference w:id="15"/>
+      </w:r>
+      <w:r>
+        <w:rPr>
+          <w:rFonts w:ascii="Times New Roman" w:cs="Times New Roman" w:eastAsia="Times New Roman" w:hAnsi="Times New Roman"/>
+          <w:sz w:val="24"/>
+          <w:szCs w:val="24"/>
+        </w:rPr>
+        <w:t xml:space="preserve"> Military operations in the former tribal areas and Balochistan could also come under international scrutiny if Pakistan joined.</w:t>
       </w:r>
     </w:p>
     <w:p>
@@ -367,7 +449,7 @@
           <w:szCs w:val="24"/>
           <w:vertAlign w:val="superscript"/>
         </w:rPr>
-        <w:footnoteReference w:id="11"/>
+        <w:footnoteReference w:id="16"/>
       </w:r>
       <w:r>
         <w:rPr>
@@ -385,25 +467,43 @@
           <w:szCs w:val="24"/>
           <w:vertAlign w:val="superscript"/>
         </w:rPr>
-        <w:footnoteReference w:id="12"/>
-      </w:r>
-      <w:r>
-        <w:rPr>
-          <w:rFonts w:ascii="Times New Roman" w:cs="Times New Roman" w:eastAsia="Times New Roman" w:hAnsi="Times New Roman"/>
-          <w:sz w:val="24"/>
-          <w:szCs w:val="24"/>
-        </w:rPr>
-        <w:t xml:space="preserve"> At Pakistan's third review, held in November 2017, Pakistan received 289 recommendations. It supported 168, "noted" 117 and rejected four, and several submissions called on Pakistan to join the ICC.</w:t>
-      </w:r>
-      <w:r>
-        <w:rPr>
-          <w:rStyle w:val="FootnoteReference"/>
-          <w:rFonts w:ascii="Times New Roman" w:cs="Times New Roman" w:eastAsia="Times New Roman" w:hAnsi="Times New Roman"/>
-          <w:sz w:val="24"/>
-          <w:szCs w:val="24"/>
-          <w:vertAlign w:val="superscript"/>
-        </w:rPr>
-        <w:footnoteReference w:id="13"/>
+        <w:footnoteReference w:id="17"/>
+      </w:r>
+      <w:r>
+        <w:rPr>
+          <w:rFonts w:ascii="Times New Roman" w:cs="Times New Roman" w:eastAsia="Times New Roman" w:hAnsi="Times New Roman"/>
+          <w:sz w:val="24"/>
+          <w:szCs w:val="24"/>
+        </w:rPr>
+        <w:t xml:space="preserve"> At Pakistan's third review, held in November 2017, Pakistan received 289 recommendations.</w:t>
+      </w:r>
+      <w:r>
+        <w:rPr>
+          <w:rStyle w:val="FootnoteReference"/>
+          <w:rFonts w:ascii="Times New Roman" w:cs="Times New Roman" w:eastAsia="Times New Roman" w:hAnsi="Times New Roman"/>
+          <w:sz w:val="24"/>
+          <w:szCs w:val="24"/>
+          <w:vertAlign w:val="superscript"/>
+        </w:rPr>
+        <w:footnoteReference w:id="18"/>
+      </w:r>
+      <w:r>
+        <w:rPr>
+          <w:rFonts w:ascii="Times New Roman" w:cs="Times New Roman" w:eastAsia="Times New Roman" w:hAnsi="Times New Roman"/>
+          <w:sz w:val="24"/>
+          <w:szCs w:val="24"/>
+        </w:rPr>
+        <w:t xml:space="preserve"> It supported 168, "noted" 117 and rejected four, and several submissions called on Pakistan to join the ICC.</w:t>
+      </w:r>
+      <w:r>
+        <w:rPr>
+          <w:rStyle w:val="FootnoteReference"/>
+          <w:rFonts w:ascii="Times New Roman" w:cs="Times New Roman" w:eastAsia="Times New Roman" w:hAnsi="Times New Roman"/>
+          <w:sz w:val="24"/>
+          <w:szCs w:val="24"/>
+          <w:vertAlign w:val="superscript"/>
+        </w:rPr>
+        <w:footnoteReference w:id="19"/>
       </w:r>
     </w:p>
     <w:p>
@@ -417,17 +517,35 @@
           <w:sz w:val="24"/>
           <w:szCs w:val="24"/>
         </w:rPr>
-        <w:t xml:space="preserve">In 2019, Pakistan's interest in the Court took a different form. On 5 August 2019, India revoked the special constitutional status of Jammu and Kashmir. The following day, Prime Minister Imran Khan told a joint session of Parliament that Pakistan would raise the issue at the UN Security Council and was assessing ways to take it to the International Criminal Court.</w:t>
-      </w:r>
-      <w:r>
-        <w:rPr>
-          <w:rStyle w:val="FootnoteReference"/>
-          <w:rFonts w:ascii="Times New Roman" w:cs="Times New Roman" w:eastAsia="Times New Roman" w:hAnsi="Times New Roman"/>
-          <w:sz w:val="24"/>
-          <w:szCs w:val="24"/>
-          <w:vertAlign w:val="superscript"/>
-        </w:rPr>
-        <w:footnoteReference w:id="14"/>
+        <w:t xml:space="preserve">In 2019, Pakistan's interest in the Court took a different form. On 5 August 2019, India revoked the special constitutional status of Jammu and Kashmir.</w:t>
+      </w:r>
+      <w:r>
+        <w:rPr>
+          <w:rStyle w:val="FootnoteReference"/>
+          <w:rFonts w:ascii="Times New Roman" w:cs="Times New Roman" w:eastAsia="Times New Roman" w:hAnsi="Times New Roman"/>
+          <w:sz w:val="24"/>
+          <w:szCs w:val="24"/>
+          <w:vertAlign w:val="superscript"/>
+        </w:rPr>
+        <w:footnoteReference w:id="20"/>
+      </w:r>
+      <w:r>
+        <w:rPr>
+          <w:rFonts w:ascii="Times New Roman" w:cs="Times New Roman" w:eastAsia="Times New Roman" w:hAnsi="Times New Roman"/>
+          <w:sz w:val="24"/>
+          <w:szCs w:val="24"/>
+        </w:rPr>
+        <w:t xml:space="preserve"> The following day, Prime Minister Imran Khan told a joint session of Parliament that Pakistan would raise the issue at the UN Security Council and was assessing ways to take it to the International Criminal Court.</w:t>
+      </w:r>
+      <w:r>
+        <w:rPr>
+          <w:rStyle w:val="FootnoteReference"/>
+          <w:rFonts w:ascii="Times New Roman" w:cs="Times New Roman" w:eastAsia="Times New Roman" w:hAnsi="Times New Roman"/>
+          <w:sz w:val="24"/>
+          <w:szCs w:val="24"/>
+          <w:vertAlign w:val="superscript"/>
+        </w:rPr>
+        <w:footnoteReference w:id="21"/>
       </w:r>
       <w:r>
         <w:rPr>
@@ -445,25 +563,43 @@
           <w:szCs w:val="24"/>
           <w:vertAlign w:val="superscript"/>
         </w:rPr>
-        <w:footnoteReference w:id="15"/>
-      </w:r>
-      <w:r>
-        <w:rPr>
-          <w:rFonts w:ascii="Times New Roman" w:cs="Times New Roman" w:eastAsia="Times New Roman" w:hAnsi="Times New Roman"/>
-          <w:sz w:val="24"/>
-          <w:szCs w:val="24"/>
-        </w:rPr>
-        <w:t xml:space="preserve"> Neither plan went ahead. Because neither Pakistan nor India is a party to the Rome Statute, the ICC has no jurisdiction unless the Security Council refers the situation, and that is politically unrealistic.</w:t>
-      </w:r>
-      <w:r>
-        <w:rPr>
-          <w:rStyle w:val="FootnoteReference"/>
-          <w:rFonts w:ascii="Times New Roman" w:cs="Times New Roman" w:eastAsia="Times New Roman" w:hAnsi="Times New Roman"/>
-          <w:sz w:val="24"/>
-          <w:szCs w:val="24"/>
-          <w:vertAlign w:val="superscript"/>
-        </w:rPr>
-        <w:footnoteReference w:id="16"/>
+        <w:footnoteReference w:id="22"/>
+      </w:r>
+      <w:r>
+        <w:rPr>
+          <w:rFonts w:ascii="Times New Roman" w:cs="Times New Roman" w:eastAsia="Times New Roman" w:hAnsi="Times New Roman"/>
+          <w:sz w:val="24"/>
+          <w:szCs w:val="24"/>
+        </w:rPr>
+        <w:t xml:space="preserve"> Neither plan went ahead.</w:t>
+      </w:r>
+      <w:r>
+        <w:rPr>
+          <w:rStyle w:val="FootnoteReference"/>
+          <w:rFonts w:ascii="Times New Roman" w:cs="Times New Roman" w:eastAsia="Times New Roman" w:hAnsi="Times New Roman"/>
+          <w:sz w:val="24"/>
+          <w:szCs w:val="24"/>
+          <w:vertAlign w:val="superscript"/>
+        </w:rPr>
+        <w:footnoteReference w:id="23"/>
+      </w:r>
+      <w:r>
+        <w:rPr>
+          <w:rFonts w:ascii="Times New Roman" w:cs="Times New Roman" w:eastAsia="Times New Roman" w:hAnsi="Times New Roman"/>
+          <w:sz w:val="24"/>
+          <w:szCs w:val="24"/>
+        </w:rPr>
+        <w:t xml:space="preserve"> Because neither Pakistan nor India is a party to the Rome Statute, the ICC has no jurisdiction unless the Security Council refers the situation, and that is politically unrealistic.</w:t>
+      </w:r>
+      <w:r>
+        <w:rPr>
+          <w:rStyle w:val="FootnoteReference"/>
+          <w:rFonts w:ascii="Times New Roman" w:cs="Times New Roman" w:eastAsia="Times New Roman" w:hAnsi="Times New Roman"/>
+          <w:sz w:val="24"/>
+          <w:szCs w:val="24"/>
+          <w:vertAlign w:val="superscript"/>
+        </w:rPr>
+        <w:footnoteReference w:id="24"/>
       </w:r>
       <w:r>
         <w:rPr>
@@ -481,7 +617,7 @@
           <w:szCs w:val="24"/>
           <w:vertAlign w:val="superscript"/>
         </w:rPr>
-        <w:footnoteReference w:id="17"/>
+        <w:footnoteReference w:id="25"/>
       </w:r>
     </w:p>
     <w:p>
@@ -511,17 +647,71 @@
           <w:sz w:val="24"/>
           <w:szCs w:val="24"/>
         </w:rPr>
-        <w:t xml:space="preserve">Pakistan's fourth UPR took place in January 2023. Liechtenstein and Luxembourg recommended that Pakistan accede to the Rome Statute, including its 2010 amendments. When the outcome was adopted in July 2023, Pakistan supported 253 of the 340 recommendations it received, but it has taken no step towards accession.</w:t>
-      </w:r>
-      <w:r>
-        <w:rPr>
-          <w:rStyle w:val="FootnoteReference"/>
-          <w:rFonts w:ascii="Times New Roman" w:cs="Times New Roman" w:eastAsia="Times New Roman" w:hAnsi="Times New Roman"/>
-          <w:sz w:val="24"/>
-          <w:szCs w:val="24"/>
-          <w:vertAlign w:val="superscript"/>
-        </w:rPr>
-        <w:footnoteReference w:id="18"/>
+        <w:t xml:space="preserve">Pakistan's fourth UPR took place in January 2023.</w:t>
+      </w:r>
+      <w:r>
+        <w:rPr>
+          <w:rStyle w:val="FootnoteReference"/>
+          <w:rFonts w:ascii="Times New Roman" w:cs="Times New Roman" w:eastAsia="Times New Roman" w:hAnsi="Times New Roman"/>
+          <w:sz w:val="24"/>
+          <w:szCs w:val="24"/>
+          <w:vertAlign w:val="superscript"/>
+        </w:rPr>
+        <w:footnoteReference w:id="26"/>
+      </w:r>
+      <w:r>
+        <w:rPr>
+          <w:rFonts w:ascii="Times New Roman" w:cs="Times New Roman" w:eastAsia="Times New Roman" w:hAnsi="Times New Roman"/>
+          <w:sz w:val="24"/>
+          <w:szCs w:val="24"/>
+        </w:rPr>
+        <w:t xml:space="preserve"> Liechtenstein and Luxembourg recommended that Pakistan accede to the Rome Statute, including its 2010 amendments.</w:t>
+      </w:r>
+      <w:r>
+        <w:rPr>
+          <w:rStyle w:val="FootnoteReference"/>
+          <w:rFonts w:ascii="Times New Roman" w:cs="Times New Roman" w:eastAsia="Times New Roman" w:hAnsi="Times New Roman"/>
+          <w:sz w:val="24"/>
+          <w:szCs w:val="24"/>
+          <w:vertAlign w:val="superscript"/>
+        </w:rPr>
+        <w:footnoteReference w:id="27"/>
+      </w:r>
+      <w:r>
+        <w:rPr>
+          <w:rFonts w:ascii="Times New Roman" w:cs="Times New Roman" w:eastAsia="Times New Roman" w:hAnsi="Times New Roman"/>
+          <w:sz w:val="24"/>
+          <w:szCs w:val="24"/>
+        </w:rPr>
+        <w:t xml:space="preserve"> When the outcome was adopted in July 2023, Pakistan supported 253 of the 340 recommendations it received.</w:t>
+      </w:r>
+      <w:r>
+        <w:rPr>
+          <w:rStyle w:val="FootnoteReference"/>
+          <w:rFonts w:ascii="Times New Roman" w:cs="Times New Roman" w:eastAsia="Times New Roman" w:hAnsi="Times New Roman"/>
+          <w:sz w:val="24"/>
+          <w:szCs w:val="24"/>
+          <w:vertAlign w:val="superscript"/>
+        </w:rPr>
+        <w:footnoteReference w:id="28"/>
+      </w:r>
+      <w:r>
+        <w:rPr>
+          <w:rFonts w:ascii="Times New Roman" w:cs="Times New Roman" w:eastAsia="Times New Roman" w:hAnsi="Times New Roman"/>
+          <w:sz w:val="24"/>
+          <w:szCs w:val="24"/>
+        </w:rPr>
+        <w:t xml:space="preserve"> It has taken no step towards accession since then.</w:t>
+      </w:r>
+      <w:r>
+        <w:rPr>
+          <w:rStyle w:val="FootnoteReference"/>
+          <w:rFonts w:ascii="Times New Roman" w:cs="Times New Roman" w:eastAsia="Times New Roman" w:hAnsi="Times New Roman"/>
+          <w:sz w:val="24"/>
+          <w:szCs w:val="24"/>
+          <w:vertAlign w:val="superscript"/>
+        </w:rPr>
+        <w:footnoteReference w:id="29"/>
       </w:r>
       <w:r>
         <w:rPr>
@@ -539,7 +729,7 @@
           <w:szCs w:val="24"/>
           <w:vertAlign w:val="superscript"/>
         </w:rPr>
-        <w:footnoteReference w:id="19"/>
+        <w:footnoteReference w:id="30"/>
       </w:r>
     </w:p>
     <w:p>
@@ -563,7 +753,7 @@
           <w:szCs w:val="24"/>
           <w:vertAlign w:val="superscript"/>
         </w:rPr>
-        <w:footnoteReference w:id="20"/>
+        <w:footnoteReference w:id="31"/>
       </w:r>
     </w:p>
     <w:p>
@@ -592,7 +782,7 @@
           <w:szCs w:val="24"/>
           <w:vertAlign w:val="superscript"/>
         </w:rPr>
-        <w:footnoteReference w:id="21"/>
+        <w:footnoteReference w:id="32"/>
       </w:r>
     </w:p>
     <w:p>
@@ -629,17 +819,35 @@
           <w:sz w:val="24"/>
           <w:szCs w:val="24"/>
         </w:rPr>
-        <w:t xml:space="preserve">. In it, parliamentarians committed to pushing their governments to ratify the Rome Statute and to bring its principles into domestic law.</w:t>
-      </w:r>
-      <w:r>
-        <w:rPr>
-          <w:rStyle w:val="FootnoteReference"/>
-          <w:rFonts w:ascii="Times New Roman" w:cs="Times New Roman" w:eastAsia="Times New Roman" w:hAnsi="Times New Roman"/>
-          <w:sz w:val="24"/>
-          <w:szCs w:val="24"/>
-          <w:vertAlign w:val="superscript"/>
-        </w:rPr>
-        <w:footnoteReference w:id="22"/>
+        <w:t xml:space="preserve">.</w:t>
+      </w:r>
+      <w:r>
+        <w:rPr>
+          <w:rStyle w:val="FootnoteReference"/>
+          <w:rFonts w:ascii="Times New Roman" w:cs="Times New Roman" w:eastAsia="Times New Roman" w:hAnsi="Times New Roman"/>
+          <w:sz w:val="24"/>
+          <w:szCs w:val="24"/>
+          <w:vertAlign w:val="superscript"/>
+        </w:rPr>
+        <w:footnoteReference w:id="33"/>
+      </w:r>
+      <w:r>
+        <w:rPr>
+          <w:rFonts w:ascii="Times New Roman" w:cs="Times New Roman" w:eastAsia="Times New Roman" w:hAnsi="Times New Roman"/>
+          <w:sz w:val="24"/>
+          <w:szCs w:val="24"/>
+        </w:rPr>
+        <w:t xml:space="preserve"> In it, parliamentarians committed to pushing their governments to ratify the Rome Statute and to bring its principles into domestic law.</w:t>
+      </w:r>
+      <w:r>
+        <w:rPr>
+          <w:rStyle w:val="FootnoteReference"/>
+          <w:rFonts w:ascii="Times New Roman" w:cs="Times New Roman" w:eastAsia="Times New Roman" w:hAnsi="Times New Roman"/>
+          <w:sz w:val="24"/>
+          <w:szCs w:val="24"/>
+          <w:vertAlign w:val="superscript"/>
+        </w:rPr>
+        <w:footnoteReference w:id="34"/>
       </w:r>
     </w:p>
     <w:p>
@@ -682,25 +890,43 @@
           <w:szCs w:val="24"/>
           <w:vertAlign w:val="superscript"/>
         </w:rPr>
-        <w:footnoteReference w:id="23"/>
-      </w:r>
-      <w:r>
-        <w:rPr>
-          <w:rFonts w:ascii="Times New Roman" w:cs="Times New Roman" w:eastAsia="Times New Roman" w:hAnsi="Times New Roman"/>
-          <w:sz w:val="24"/>
-          <w:szCs w:val="24"/>
-        </w:rPr>
-        <w:t xml:space="preserve"> From then on, Pakistani leaders used these warrants as moral and legal authority in their criticism of Israel's conduct in Gaza. Pakistani engagement with the Court's institutions also continued: in July 2025, Pakistani MP Syed Naveed Qamar spoke at the Assembly of States Parties' special session on the crime of aggression in New York.</w:t>
-      </w:r>
-      <w:r>
-        <w:rPr>
-          <w:rStyle w:val="FootnoteReference"/>
-          <w:rFonts w:ascii="Times New Roman" w:cs="Times New Roman" w:eastAsia="Times New Roman" w:hAnsi="Times New Roman"/>
-          <w:sz w:val="24"/>
-          <w:szCs w:val="24"/>
-          <w:vertAlign w:val="superscript"/>
-        </w:rPr>
-        <w:footnoteReference w:id="24"/>
+        <w:footnoteReference w:id="35"/>
+      </w:r>
+      <w:r>
+        <w:rPr>
+          <w:rFonts w:ascii="Times New Roman" w:cs="Times New Roman" w:eastAsia="Times New Roman" w:hAnsi="Times New Roman"/>
+          <w:sz w:val="24"/>
+          <w:szCs w:val="24"/>
+        </w:rPr>
+        <w:t xml:space="preserve"> As Section 4 shows, Pakistani leaders went on to cite these warrants as moral and legal authority in their criticism of Israel's conduct in Gaza.</w:t>
+      </w:r>
+      <w:r>
+        <w:rPr>
+          <w:rStyle w:val="FootnoteReference"/>
+          <w:rFonts w:ascii="Times New Roman" w:cs="Times New Roman" w:eastAsia="Times New Roman" w:hAnsi="Times New Roman"/>
+          <w:sz w:val="24"/>
+          <w:szCs w:val="24"/>
+          <w:vertAlign w:val="superscript"/>
+        </w:rPr>
+        <w:footnoteReference w:id="36"/>
+      </w:r>
+      <w:r>
+        <w:rPr>
+          <w:rFonts w:ascii="Times New Roman" w:cs="Times New Roman" w:eastAsia="Times New Roman" w:hAnsi="Times New Roman"/>
+          <w:sz w:val="24"/>
+          <w:szCs w:val="24"/>
+        </w:rPr>
+        <w:t xml:space="preserve"> Pakistani engagement with the Court's institutions also continued: in July 2025, Pakistani MP Syed Naveed Qamar spoke at the Assembly of States Parties' special session on the crime of aggression in New York.</w:t>
+      </w:r>
+      <w:r>
+        <w:rPr>
+          <w:rStyle w:val="FootnoteReference"/>
+          <w:rFonts w:ascii="Times New Roman" w:cs="Times New Roman" w:eastAsia="Times New Roman" w:hAnsi="Times New Roman"/>
+          <w:sz w:val="24"/>
+          <w:szCs w:val="24"/>
+          <w:vertAlign w:val="superscript"/>
+        </w:rPr>
+        <w:footnoteReference w:id="37"/>
       </w:r>
     </w:p>
     <w:p>
@@ -740,7 +966,7 @@
           <w:szCs w:val="24"/>
           <w:vertAlign w:val="superscript"/>
         </w:rPr>
-        <w:footnoteReference w:id="25"/>
+        <w:footnoteReference w:id="38"/>
       </w:r>
       <w:r>
         <w:rPr>
@@ -780,7 +1006,35 @@
           <w:sz w:val="24"/>
           <w:szCs w:val="24"/>
         </w:rPr>
-        <w:t xml:space="preserve">Pakistan is also not preparing to join. There is currently no ratification bill before Parliament, and no ministry has announced any plan to bring the Statute into domestic law. The objections Pakistan has held since 1998 remain unresolved, and the government continues to give priority to its security concerns.</w:t>
+        <w:t xml:space="preserve">Pakistan is also not preparing to join: it has not acceded to the Statute, and no government plan to bring the Statute into domestic law has been announced.</w:t>
+      </w:r>
+      <w:r>
+        <w:rPr>
+          <w:rStyle w:val="FootnoteReference"/>
+          <w:rFonts w:ascii="Times New Roman" w:cs="Times New Roman" w:eastAsia="Times New Roman" w:hAnsi="Times New Roman"/>
+          <w:sz w:val="24"/>
+          <w:szCs w:val="24"/>
+          <w:vertAlign w:val="superscript"/>
+        </w:rPr>
+        <w:footnoteReference w:id="39"/>
+      </w:r>
+      <w:r>
+        <w:rPr>
+          <w:rFonts w:ascii="Times New Roman" w:cs="Times New Roman" w:eastAsia="Times New Roman" w:hAnsi="Times New Roman"/>
+          <w:sz w:val="24"/>
+          <w:szCs w:val="24"/>
+        </w:rPr>
+        <w:t xml:space="preserve"> The objections Pakistan has held since 1998 remain unresolved, and the government continues to give priority to its security concerns.</w:t>
+      </w:r>
+      <w:r>
+        <w:rPr>
+          <w:rStyle w:val="FootnoteReference"/>
+          <w:rFonts w:ascii="Times New Roman" w:cs="Times New Roman" w:eastAsia="Times New Roman" w:hAnsi="Times New Roman"/>
+          <w:sz w:val="24"/>
+          <w:szCs w:val="24"/>
+          <w:vertAlign w:val="superscript"/>
+        </w:rPr>
+        <w:footnoteReference w:id="40"/>
       </w:r>
     </w:p>
     <w:p>
@@ -794,7 +1048,43 @@
           <w:sz w:val="24"/>
           <w:szCs w:val="24"/>
         </w:rPr>
-        <w:t xml:space="preserve">Support for the Court comes mainly from Parliament and from the legal and academic communities. In Parliament, the 2024 Islamabad meeting showed that some legislators are open to ratification. In the legal community and academia, commentators such as Hamdani have argued for ratification, and journals including the </w:t>
+        <w:t xml:space="preserve">Support for the Court comes mainly from Parliament and from the legal and academic communities. In Parliament, the 2024 Islamabad meeting showed that some legislators are open to ratification.</w:t>
+      </w:r>
+      <w:r>
+        <w:rPr>
+          <w:rStyle w:val="FootnoteReference"/>
+          <w:rFonts w:ascii="Times New Roman" w:cs="Times New Roman" w:eastAsia="Times New Roman" w:hAnsi="Times New Roman"/>
+          <w:sz w:val="24"/>
+          <w:szCs w:val="24"/>
+          <w:vertAlign w:val="superscript"/>
+        </w:rPr>
+        <w:footnoteReference w:id="41"/>
+      </w:r>
+      <w:r>
+        <w:rPr>
+          <w:rFonts w:ascii="Times New Roman" w:cs="Times New Roman" w:eastAsia="Times New Roman" w:hAnsi="Times New Roman"/>
+          <w:sz w:val="24"/>
+          <w:szCs w:val="24"/>
+        </w:rPr>
+        <w:t xml:space="preserve"> In the legal community, commentators such as Hamdani have argued for ratification.</w:t>
+      </w:r>
+      <w:r>
+        <w:rPr>
+          <w:rStyle w:val="FootnoteReference"/>
+          <w:rFonts w:ascii="Times New Roman" w:cs="Times New Roman" w:eastAsia="Times New Roman" w:hAnsi="Times New Roman"/>
+          <w:sz w:val="24"/>
+          <w:szCs w:val="24"/>
+          <w:vertAlign w:val="superscript"/>
+        </w:rPr>
+        <w:footnoteReference w:id="42"/>
+      </w:r>
+      <w:r>
+        <w:rPr>
+          <w:rFonts w:ascii="Times New Roman" w:cs="Times New Roman" w:eastAsia="Times New Roman" w:hAnsi="Times New Roman"/>
+          <w:sz w:val="24"/>
+          <w:szCs w:val="24"/>
+        </w:rPr>
+        <w:t xml:space="preserve"> In academia, journals including the </w:t>
       </w:r>
       <w:r>
         <w:rPr>
@@ -840,15 +1130,25 @@
           <w:szCs w:val="24"/>
           <w:vertAlign w:val="superscript"/>
         </w:rPr>
-        <w:footnoteReference w:id="26"/>
-      </w:r>
-      <w:r>
-        <w:rPr>
-          <w:rFonts w:ascii="Times New Roman" w:cs="Times New Roman" w:eastAsia="Times New Roman" w:hAnsi="Times New Roman"/>
-          <w:sz w:val="24"/>
-          <w:szCs w:val="24"/>
-        </w:rPr>
-        <w:t xml:space="preserve"> Among the general public, awareness of the ICC is limited and tends to rise only around high-profile issues such as Gaza or Kashmir.</w:t>
+        <w:footnoteReference w:id="43"/>
+      </w:r>
+      <w:r>
+        <w:rPr>
+          <w:rFonts w:ascii="Times New Roman" w:cs="Times New Roman" w:eastAsia="Times New Roman" w:hAnsi="Times New Roman"/>
+          <w:sz w:val="24"/>
+          <w:szCs w:val="24"/>
+        </w:rPr>
+        <w:t xml:space="preserve"> Wider public debate about the Court tends to rise around high-profile issues such as Kashmir and Gaza, as the statements discussed above show.</w:t>
+      </w:r>
+      <w:r>
+        <w:rPr>
+          <w:rStyle w:val="FootnoteReference"/>
+          <w:rFonts w:ascii="Times New Roman" w:cs="Times New Roman" w:eastAsia="Times New Roman" w:hAnsi="Times New Roman"/>
+          <w:sz w:val="24"/>
+          <w:szCs w:val="24"/>
+          <w:vertAlign w:val="superscript"/>
+        </w:rPr>
+        <w:footnoteReference w:id="44"/>
       </w:r>
     </w:p>
     <w:p>
@@ -958,6 +1258,39 @@
           <w:sz w:val="20"/>
           <w:szCs w:val="20"/>
         </w:rPr>
+        <w:t xml:space="preserve">Assembly of States Parties to the Rome Statute, 'The States Parties to the Rome Statute' &lt;https://asp.icc-cpi.int/states-parties&gt; accessed 1 October 2026.</w:t>
+      </w:r>
+    </w:p>
+  </w:footnote>
+  <w:footnote w:id="2">
+    <w:p>
+      <w:pPr>
+        <w:pStyle w:val="FootnoteText"/>
+      </w:pPr>
+      <w:r>
+        <w:rPr>
+          <w:rStyle w:val="FootnoteReference"/>
+          <w:rFonts w:ascii="Times New Roman" w:cs="Times New Roman" w:eastAsia="Times New Roman" w:hAnsi="Times New Roman"/>
+          <w:sz w:val="20"/>
+          <w:szCs w:val="20"/>
+          <w:vertAlign w:val="superscript"/>
+        </w:rPr>
+        <w:footnoteRef/>
+      </w:r>
+      <w:r>
+        <w:rPr>
+          <w:rFonts w:ascii="Times New Roman" w:cs="Times New Roman" w:eastAsia="Times New Roman" w:hAnsi="Times New Roman"/>
+          <w:sz w:val="20"/>
+          <w:szCs w:val="20"/>
+        </w:rPr>
+        <w:t xml:space="preserve"> </w:t>
+      </w:r>
+      <w:r>
+        <w:rPr>
+          <w:rFonts w:ascii="Times New Roman" w:cs="Times New Roman" w:eastAsia="Times New Roman" w:hAnsi="Times New Roman"/>
+          <w:sz w:val="20"/>
+          <w:szCs w:val="20"/>
+        </w:rPr>
         <w:t xml:space="preserve">Mazhar Ali Khan, 'Pakistan's Commitment to Human Rights: A Probe into the Question of Ratification of the Rome Statute of International Criminal Court' (2019) 5(1) </w:t>
       </w:r>
       <w:r>
@@ -998,39 +1331,6 @@
       </w:r>
     </w:p>
   </w:footnote>
-  <w:footnote w:id="2">
-    <w:p>
-      <w:pPr>
-        <w:pStyle w:val="FootnoteText"/>
-      </w:pPr>
-      <w:r>
-        <w:rPr>
-          <w:rStyle w:val="FootnoteReference"/>
-          <w:rFonts w:ascii="Times New Roman" w:cs="Times New Roman" w:eastAsia="Times New Roman" w:hAnsi="Times New Roman"/>
-          <w:sz w:val="20"/>
-          <w:szCs w:val="20"/>
-          <w:vertAlign w:val="superscript"/>
-        </w:rPr>
-        <w:footnoteRef/>
-      </w:r>
-      <w:r>
-        <w:rPr>
-          <w:rFonts w:ascii="Times New Roman" w:cs="Times New Roman" w:eastAsia="Times New Roman" w:hAnsi="Times New Roman"/>
-          <w:sz w:val="20"/>
-          <w:szCs w:val="20"/>
-        </w:rPr>
-        <w:t xml:space="preserve"> </w:t>
-      </w:r>
-      <w:r>
-        <w:rPr>
-          <w:rFonts w:ascii="Times New Roman" w:cs="Times New Roman" w:eastAsia="Times New Roman" w:hAnsi="Times New Roman"/>
-          <w:sz w:val="20"/>
-          <w:szCs w:val="20"/>
-        </w:rPr>
-        <w:t xml:space="preserve">Naveed-ur-Rehman, Chaudhry and Niazi (n 1), citing a 1998 United Nations press release.</w:t>
-      </w:r>
-    </w:p>
-  </w:footnote>
   <w:footnote w:id="3">
     <w:p>
       <w:pPr>
@@ -1060,7 +1360,7 @@
           <w:sz w:val="20"/>
           <w:szCs w:val="20"/>
         </w:rPr>
-        <w:t xml:space="preserve">Rome Statute of the International Criminal Court (adopted 17 July 1998, entered into force 1 July 2002) 2187 UNTS 3 (Rome Statute), arts 125–126.</w:t>
+        <w:t xml:space="preserve">Naveed-ur-Rehman, Chaudhry and Niazi (n 2), citing a 1998 United Nations press release.</w:t>
       </w:r>
     </w:p>
   </w:footnote>
@@ -1093,7 +1393,7 @@
           <w:sz w:val="20"/>
           <w:szCs w:val="20"/>
         </w:rPr>
-        <w:t xml:space="preserve">Khan (n 1); Naveed-ur-Rehman, Chaudhry and Niazi (n 1).</w:t>
+        <w:t xml:space="preserve">Khan (n 2); Naveed-ur-Rehman, Chaudhry and Niazi (n 2). On complementarity, see Rome Statute of the International Criminal Court (adopted 17 July 1998, entered into force 1 July 2002) 2187 UNTS 3 (Rome Statute), preamble para 10 and arts 1, 17.</w:t>
       </w:r>
     </w:p>
   </w:footnote>
@@ -1126,7 +1426,7 @@
           <w:sz w:val="20"/>
           <w:szCs w:val="20"/>
         </w:rPr>
-        <w:t xml:space="preserve">Rome Statute (n 3) art 27.</w:t>
+        <w:t xml:space="preserve">Rome Statute (n 4) arts 125–126; Khan (n 2); Naveed-ur-Rehman, Chaudhry and Niazi (n 2).</w:t>
       </w:r>
     </w:p>
   </w:footnote>
@@ -1159,76 +1459,76 @@
           <w:sz w:val="20"/>
           <w:szCs w:val="20"/>
         </w:rPr>
+        <w:t xml:space="preserve">Khan (n 2); Naveed-ur-Rehman, Chaudhry and Niazi (n 2).</w:t>
+      </w:r>
+    </w:p>
+  </w:footnote>
+  <w:footnote w:id="7">
+    <w:p>
+      <w:pPr>
+        <w:pStyle w:val="FootnoteText"/>
+      </w:pPr>
+      <w:r>
+        <w:rPr>
+          <w:rStyle w:val="FootnoteReference"/>
+          <w:rFonts w:ascii="Times New Roman" w:cs="Times New Roman" w:eastAsia="Times New Roman" w:hAnsi="Times New Roman"/>
+          <w:sz w:val="20"/>
+          <w:szCs w:val="20"/>
+          <w:vertAlign w:val="superscript"/>
+        </w:rPr>
+        <w:footnoteRef/>
+      </w:r>
+      <w:r>
+        <w:rPr>
+          <w:rFonts w:ascii="Times New Roman" w:cs="Times New Roman" w:eastAsia="Times New Roman" w:hAnsi="Times New Roman"/>
+          <w:sz w:val="20"/>
+          <w:szCs w:val="20"/>
+        </w:rPr>
+        <w:t xml:space="preserve"> </w:t>
+      </w:r>
+      <w:r>
+        <w:rPr>
+          <w:rFonts w:ascii="Times New Roman" w:cs="Times New Roman" w:eastAsia="Times New Roman" w:hAnsi="Times New Roman"/>
+          <w:sz w:val="20"/>
+          <w:szCs w:val="20"/>
+        </w:rPr>
+        <w:t xml:space="preserve">Rome Statute (n 4) art 27.</w:t>
+      </w:r>
+    </w:p>
+  </w:footnote>
+  <w:footnote w:id="8">
+    <w:p>
+      <w:pPr>
+        <w:pStyle w:val="FootnoteText"/>
+      </w:pPr>
+      <w:r>
+        <w:rPr>
+          <w:rStyle w:val="FootnoteReference"/>
+          <w:rFonts w:ascii="Times New Roman" w:cs="Times New Roman" w:eastAsia="Times New Roman" w:hAnsi="Times New Roman"/>
+          <w:sz w:val="20"/>
+          <w:szCs w:val="20"/>
+          <w:vertAlign w:val="superscript"/>
+        </w:rPr>
+        <w:footnoteRef/>
+      </w:r>
+      <w:r>
+        <w:rPr>
+          <w:rFonts w:ascii="Times New Roman" w:cs="Times New Roman" w:eastAsia="Times New Roman" w:hAnsi="Times New Roman"/>
+          <w:sz w:val="20"/>
+          <w:szCs w:val="20"/>
+        </w:rPr>
+        <w:t xml:space="preserve"> </w:t>
+      </w:r>
+      <w:r>
+        <w:rPr>
+          <w:rFonts w:ascii="Times New Roman" w:cs="Times New Roman" w:eastAsia="Times New Roman" w:hAnsi="Times New Roman"/>
+          <w:sz w:val="20"/>
+          <w:szCs w:val="20"/>
+        </w:rPr>
         <w:t xml:space="preserve">Constitution of the Islamic Republic of Pakistan 1973, art 248(1)–(2).</w:t>
       </w:r>
     </w:p>
   </w:footnote>
-  <w:footnote w:id="7">
-    <w:p>
-      <w:pPr>
-        <w:pStyle w:val="FootnoteText"/>
-      </w:pPr>
-      <w:r>
-        <w:rPr>
-          <w:rStyle w:val="FootnoteReference"/>
-          <w:rFonts w:ascii="Times New Roman" w:cs="Times New Roman" w:eastAsia="Times New Roman" w:hAnsi="Times New Roman"/>
-          <w:sz w:val="20"/>
-          <w:szCs w:val="20"/>
-          <w:vertAlign w:val="superscript"/>
-        </w:rPr>
-        <w:footnoteRef/>
-      </w:r>
-      <w:r>
-        <w:rPr>
-          <w:rFonts w:ascii="Times New Roman" w:cs="Times New Roman" w:eastAsia="Times New Roman" w:hAnsi="Times New Roman"/>
-          <w:sz w:val="20"/>
-          <w:szCs w:val="20"/>
-        </w:rPr>
-        <w:t xml:space="preserve"> </w:t>
-      </w:r>
-      <w:r>
-        <w:rPr>
-          <w:rFonts w:ascii="Times New Roman" w:cs="Times New Roman" w:eastAsia="Times New Roman" w:hAnsi="Times New Roman"/>
-          <w:sz w:val="20"/>
-          <w:szCs w:val="20"/>
-        </w:rPr>
-        <w:t xml:space="preserve">Rome Statute (n 3) art 120.</w:t>
-      </w:r>
-    </w:p>
-  </w:footnote>
-  <w:footnote w:id="8">
-    <w:p>
-      <w:pPr>
-        <w:pStyle w:val="FootnoteText"/>
-      </w:pPr>
-      <w:r>
-        <w:rPr>
-          <w:rStyle w:val="FootnoteReference"/>
-          <w:rFonts w:ascii="Times New Roman" w:cs="Times New Roman" w:eastAsia="Times New Roman" w:hAnsi="Times New Roman"/>
-          <w:sz w:val="20"/>
-          <w:szCs w:val="20"/>
-          <w:vertAlign w:val="superscript"/>
-        </w:rPr>
-        <w:footnoteRef/>
-      </w:r>
-      <w:r>
-        <w:rPr>
-          <w:rFonts w:ascii="Times New Roman" w:cs="Times New Roman" w:eastAsia="Times New Roman" w:hAnsi="Times New Roman"/>
-          <w:sz w:val="20"/>
-          <w:szCs w:val="20"/>
-        </w:rPr>
-        <w:t xml:space="preserve"> </w:t>
-      </w:r>
-      <w:r>
-        <w:rPr>
-          <w:rFonts w:ascii="Times New Roman" w:cs="Times New Roman" w:eastAsia="Times New Roman" w:hAnsi="Times New Roman"/>
-          <w:sz w:val="20"/>
-          <w:szCs w:val="20"/>
-        </w:rPr>
-        <w:t xml:space="preserve">Rome Statute (n 3) arts 13(b), 16.</w:t>
-      </w:r>
-    </w:p>
-  </w:footnote>
   <w:footnote w:id="9">
     <w:p>
       <w:pPr>
@@ -1258,7 +1558,7 @@
           <w:sz w:val="20"/>
           <w:szCs w:val="20"/>
         </w:rPr>
-        <w:t xml:space="preserve">Khan (n 1); Naveed-ur-Rehman, Chaudhry and Niazi (n 1).</w:t>
+        <w:t xml:space="preserve">Khan (n 2).</w:t>
       </w:r>
     </w:p>
   </w:footnote>
@@ -1291,11 +1591,176 @@
           <w:sz w:val="20"/>
           <w:szCs w:val="20"/>
         </w:rPr>
-        <w:t xml:space="preserve">Khan (n 1); Naveed-ur-Rehman, Chaudhry and Niazi (n 1).</w:t>
+        <w:t xml:space="preserve">Rome Statute (n 4) art 120.</w:t>
       </w:r>
     </w:p>
   </w:footnote>
   <w:footnote w:id="11">
+    <w:p>
+      <w:pPr>
+        <w:pStyle w:val="FootnoteText"/>
+      </w:pPr>
+      <w:r>
+        <w:rPr>
+          <w:rStyle w:val="FootnoteReference"/>
+          <w:rFonts w:ascii="Times New Roman" w:cs="Times New Roman" w:eastAsia="Times New Roman" w:hAnsi="Times New Roman"/>
+          <w:sz w:val="20"/>
+          <w:szCs w:val="20"/>
+          <w:vertAlign w:val="superscript"/>
+        </w:rPr>
+        <w:footnoteRef/>
+      </w:r>
+      <w:r>
+        <w:rPr>
+          <w:rFonts w:ascii="Times New Roman" w:cs="Times New Roman" w:eastAsia="Times New Roman" w:hAnsi="Times New Roman"/>
+          <w:sz w:val="20"/>
+          <w:szCs w:val="20"/>
+        </w:rPr>
+        <w:t xml:space="preserve"> </w:t>
+      </w:r>
+      <w:r>
+        <w:rPr>
+          <w:rFonts w:ascii="Times New Roman" w:cs="Times New Roman" w:eastAsia="Times New Roman" w:hAnsi="Times New Roman"/>
+          <w:sz w:val="20"/>
+          <w:szCs w:val="20"/>
+        </w:rPr>
+        <w:t xml:space="preserve">Rome Statute (n 4) arts 13(b), 16.</w:t>
+      </w:r>
+    </w:p>
+  </w:footnote>
+  <w:footnote w:id="12">
+    <w:p>
+      <w:pPr>
+        <w:pStyle w:val="FootnoteText"/>
+      </w:pPr>
+      <w:r>
+        <w:rPr>
+          <w:rStyle w:val="FootnoteReference"/>
+          <w:rFonts w:ascii="Times New Roman" w:cs="Times New Roman" w:eastAsia="Times New Roman" w:hAnsi="Times New Roman"/>
+          <w:sz w:val="20"/>
+          <w:szCs w:val="20"/>
+          <w:vertAlign w:val="superscript"/>
+        </w:rPr>
+        <w:footnoteRef/>
+      </w:r>
+      <w:r>
+        <w:rPr>
+          <w:rFonts w:ascii="Times New Roman" w:cs="Times New Roman" w:eastAsia="Times New Roman" w:hAnsi="Times New Roman"/>
+          <w:sz w:val="20"/>
+          <w:szCs w:val="20"/>
+        </w:rPr>
+        <w:t xml:space="preserve"> </w:t>
+      </w:r>
+      <w:r>
+        <w:rPr>
+          <w:rFonts w:ascii="Times New Roman" w:cs="Times New Roman" w:eastAsia="Times New Roman" w:hAnsi="Times New Roman"/>
+          <w:sz w:val="20"/>
+          <w:szCs w:val="20"/>
+        </w:rPr>
+        <w:t xml:space="preserve">Khan (n 2); Naveed-ur-Rehman, Chaudhry and Niazi (n 2).</w:t>
+      </w:r>
+    </w:p>
+  </w:footnote>
+  <w:footnote w:id="13">
+    <w:p>
+      <w:pPr>
+        <w:pStyle w:val="FootnoteText"/>
+      </w:pPr>
+      <w:r>
+        <w:rPr>
+          <w:rStyle w:val="FootnoteReference"/>
+          <w:rFonts w:ascii="Times New Roman" w:cs="Times New Roman" w:eastAsia="Times New Roman" w:hAnsi="Times New Roman"/>
+          <w:sz w:val="20"/>
+          <w:szCs w:val="20"/>
+          <w:vertAlign w:val="superscript"/>
+        </w:rPr>
+        <w:footnoteRef/>
+      </w:r>
+      <w:r>
+        <w:rPr>
+          <w:rFonts w:ascii="Times New Roman" w:cs="Times New Roman" w:eastAsia="Times New Roman" w:hAnsi="Times New Roman"/>
+          <w:sz w:val="20"/>
+          <w:szCs w:val="20"/>
+        </w:rPr>
+        <w:t xml:space="preserve"> </w:t>
+      </w:r>
+      <w:r>
+        <w:rPr>
+          <w:rFonts w:ascii="Times New Roman" w:cs="Times New Roman" w:eastAsia="Times New Roman" w:hAnsi="Times New Roman"/>
+          <w:sz w:val="20"/>
+          <w:szCs w:val="20"/>
+        </w:rPr>
+        <w:t xml:space="preserve">Khan (n 2).</w:t>
+      </w:r>
+    </w:p>
+  </w:footnote>
+  <w:footnote w:id="14">
+    <w:p>
+      <w:pPr>
+        <w:pStyle w:val="FootnoteText"/>
+      </w:pPr>
+      <w:r>
+        <w:rPr>
+          <w:rStyle w:val="FootnoteReference"/>
+          <w:rFonts w:ascii="Times New Roman" w:cs="Times New Roman" w:eastAsia="Times New Roman" w:hAnsi="Times New Roman"/>
+          <w:sz w:val="20"/>
+          <w:szCs w:val="20"/>
+          <w:vertAlign w:val="superscript"/>
+        </w:rPr>
+        <w:footnoteRef/>
+      </w:r>
+      <w:r>
+        <w:rPr>
+          <w:rFonts w:ascii="Times New Roman" w:cs="Times New Roman" w:eastAsia="Times New Roman" w:hAnsi="Times New Roman"/>
+          <w:sz w:val="20"/>
+          <w:szCs w:val="20"/>
+        </w:rPr>
+        <w:t xml:space="preserve"> </w:t>
+      </w:r>
+      <w:r>
+        <w:rPr>
+          <w:rFonts w:ascii="Times New Roman" w:cs="Times New Roman" w:eastAsia="Times New Roman" w:hAnsi="Times New Roman"/>
+          <w:sz w:val="20"/>
+          <w:szCs w:val="20"/>
+        </w:rPr>
+        <w:t xml:space="preserve">Khan (n 2); Naveed-ur-Rehman, Chaudhry and Niazi (n 2).</w:t>
+      </w:r>
+    </w:p>
+  </w:footnote>
+  <w:footnote w:id="15">
+    <w:p>
+      <w:pPr>
+        <w:pStyle w:val="FootnoteText"/>
+      </w:pPr>
+      <w:r>
+        <w:rPr>
+          <w:rStyle w:val="FootnoteReference"/>
+          <w:rFonts w:ascii="Times New Roman" w:cs="Times New Roman" w:eastAsia="Times New Roman" w:hAnsi="Times New Roman"/>
+          <w:sz w:val="20"/>
+          <w:szCs w:val="20"/>
+          <w:vertAlign w:val="superscript"/>
+        </w:rPr>
+        <w:footnoteRef/>
+      </w:r>
+      <w:r>
+        <w:rPr>
+          <w:rFonts w:ascii="Times New Roman" w:cs="Times New Roman" w:eastAsia="Times New Roman" w:hAnsi="Times New Roman"/>
+          <w:sz w:val="20"/>
+          <w:szCs w:val="20"/>
+        </w:rPr>
+        <w:t xml:space="preserve"> </w:t>
+      </w:r>
+      <w:r>
+        <w:rPr>
+          <w:rFonts w:ascii="Times New Roman" w:cs="Times New Roman" w:eastAsia="Times New Roman" w:hAnsi="Times New Roman"/>
+          <w:sz w:val="20"/>
+          <w:szCs w:val="20"/>
+        </w:rPr>
+        <w:t xml:space="preserve">Khan (n 2); Naveed-ur-Rehman, Chaudhry and Niazi (n 2).</w:t>
+      </w:r>
+    </w:p>
+  </w:footnote>
+  <w:footnote w:id="16">
     <w:p>
       <w:pPr>
         <w:pStyle w:val="FootnoteText"/>
@@ -1346,7 +1811,7 @@
       </w:r>
     </w:p>
   </w:footnote>
-  <w:footnote w:id="12">
+  <w:footnote w:id="17">
     <w:p>
       <w:pPr>
         <w:pStyle w:val="FootnoteText"/>
@@ -1379,7 +1844,7 @@
       </w:r>
     </w:p>
   </w:footnote>
-  <w:footnote w:id="13">
+  <w:footnote w:id="18">
     <w:p>
       <w:pPr>
         <w:pStyle w:val="FootnoteText"/>
@@ -1412,7 +1877,73 @@
       </w:r>
     </w:p>
   </w:footnote>
-  <w:footnote w:id="14">
+  <w:footnote w:id="19">
+    <w:p>
+      <w:pPr>
+        <w:pStyle w:val="FootnoteText"/>
+      </w:pPr>
+      <w:r>
+        <w:rPr>
+          <w:rStyle w:val="FootnoteReference"/>
+          <w:rFonts w:ascii="Times New Roman" w:cs="Times New Roman" w:eastAsia="Times New Roman" w:hAnsi="Times New Roman"/>
+          <w:sz w:val="20"/>
+          <w:szCs w:val="20"/>
+          <w:vertAlign w:val="superscript"/>
+        </w:rPr>
+        <w:footnoteRef/>
+      </w:r>
+      <w:r>
+        <w:rPr>
+          <w:rFonts w:ascii="Times New Roman" w:cs="Times New Roman" w:eastAsia="Times New Roman" w:hAnsi="Times New Roman"/>
+          <w:sz w:val="20"/>
+          <w:szCs w:val="20"/>
+        </w:rPr>
+        <w:t xml:space="preserve"> </w:t>
+      </w:r>
+      <w:r>
+        <w:rPr>
+          <w:rFonts w:ascii="Times New Roman" w:cs="Times New Roman" w:eastAsia="Times New Roman" w:hAnsi="Times New Roman"/>
+          <w:sz w:val="20"/>
+          <w:szCs w:val="20"/>
+        </w:rPr>
+        <w:t xml:space="preserve">Geneva International Centre for Justice (n 18).</w:t>
+      </w:r>
+    </w:p>
+  </w:footnote>
+  <w:footnote w:id="20">
+    <w:p>
+      <w:pPr>
+        <w:pStyle w:val="FootnoteText"/>
+      </w:pPr>
+      <w:r>
+        <w:rPr>
+          <w:rStyle w:val="FootnoteReference"/>
+          <w:rFonts w:ascii="Times New Roman" w:cs="Times New Roman" w:eastAsia="Times New Roman" w:hAnsi="Times New Roman"/>
+          <w:sz w:val="20"/>
+          <w:szCs w:val="20"/>
+          <w:vertAlign w:val="superscript"/>
+        </w:rPr>
+        <w:footnoteRef/>
+      </w:r>
+      <w:r>
+        <w:rPr>
+          <w:rFonts w:ascii="Times New Roman" w:cs="Times New Roman" w:eastAsia="Times New Roman" w:hAnsi="Times New Roman"/>
+          <w:sz w:val="20"/>
+          <w:szCs w:val="20"/>
+        </w:rPr>
+        <w:t xml:space="preserve"> </w:t>
+      </w:r>
+      <w:r>
+        <w:rPr>
+          <w:rFonts w:ascii="Times New Roman" w:cs="Times New Roman" w:eastAsia="Times New Roman" w:hAnsi="Times New Roman"/>
+          <w:sz w:val="20"/>
+          <w:szCs w:val="20"/>
+        </w:rPr>
+        <w:t xml:space="preserve">Constitution (Application to Jammu and Kashmir) Order 2019 (CO 272), issued by the President of India on 5 August 2019.</w:t>
+      </w:r>
+    </w:p>
+  </w:footnote>
+  <w:footnote w:id="21">
     <w:p>
       <w:pPr>
         <w:pStyle w:val="FootnoteText"/>
@@ -1463,7 +1994,7 @@
       </w:r>
     </w:p>
   </w:footnote>
-  <w:footnote w:id="15">
+  <w:footnote w:id="22">
     <w:p>
       <w:pPr>
         <w:pStyle w:val="FootnoteText"/>
@@ -1514,237 +2045,6 @@
       </w:r>
     </w:p>
   </w:footnote>
-  <w:footnote w:id="16">
-    <w:p>
-      <w:pPr>
-        <w:pStyle w:val="FootnoteText"/>
-      </w:pPr>
-      <w:r>
-        <w:rPr>
-          <w:rStyle w:val="FootnoteReference"/>
-          <w:rFonts w:ascii="Times New Roman" w:cs="Times New Roman" w:eastAsia="Times New Roman" w:hAnsi="Times New Roman"/>
-          <w:sz w:val="20"/>
-          <w:szCs w:val="20"/>
-          <w:vertAlign w:val="superscript"/>
-        </w:rPr>
-        <w:footnoteRef/>
-      </w:r>
-      <w:r>
-        <w:rPr>
-          <w:rFonts w:ascii="Times New Roman" w:cs="Times New Roman" w:eastAsia="Times New Roman" w:hAnsi="Times New Roman"/>
-          <w:sz w:val="20"/>
-          <w:szCs w:val="20"/>
-        </w:rPr>
-        <w:t xml:space="preserve"> </w:t>
-      </w:r>
-      <w:r>
-        <w:rPr>
-          <w:rFonts w:ascii="Times New Roman" w:cs="Times New Roman" w:eastAsia="Times New Roman" w:hAnsi="Times New Roman"/>
-          <w:sz w:val="20"/>
-          <w:szCs w:val="20"/>
-        </w:rPr>
-        <w:t xml:space="preserve">Rome Statute (n 3) arts 12–13. A non-party State may also accept the Court's jurisdiction by declaration under art 12(3), but only over crimes committed on its own territory or by its own nationals, so a declaration by Pakistan could not reach conduct by Indian nationals on territory administered by India.</w:t>
-      </w:r>
-    </w:p>
-  </w:footnote>
-  <w:footnote w:id="17">
-    <w:p>
-      <w:pPr>
-        <w:pStyle w:val="FootnoteText"/>
-      </w:pPr>
-      <w:r>
-        <w:rPr>
-          <w:rStyle w:val="FootnoteReference"/>
-          <w:rFonts w:ascii="Times New Roman" w:cs="Times New Roman" w:eastAsia="Times New Roman" w:hAnsi="Times New Roman"/>
-          <w:sz w:val="20"/>
-          <w:szCs w:val="20"/>
-          <w:vertAlign w:val="superscript"/>
-        </w:rPr>
-        <w:footnoteRef/>
-      </w:r>
-      <w:r>
-        <w:rPr>
-          <w:rFonts w:ascii="Times New Roman" w:cs="Times New Roman" w:eastAsia="Times New Roman" w:hAnsi="Times New Roman"/>
-          <w:sz w:val="20"/>
-          <w:szCs w:val="20"/>
-        </w:rPr>
-        <w:t xml:space="preserve"> </w:t>
-      </w:r>
-      <w:r>
-        <w:rPr>
-          <w:rFonts w:ascii="Times New Roman" w:cs="Times New Roman" w:eastAsia="Times New Roman" w:hAnsi="Times New Roman"/>
-          <w:sz w:val="20"/>
-          <w:szCs w:val="20"/>
-        </w:rPr>
-        <w:t xml:space="preserve">Khan (n 1).</w:t>
-      </w:r>
-    </w:p>
-  </w:footnote>
-  <w:footnote w:id="18">
-    <w:p>
-      <w:pPr>
-        <w:pStyle w:val="FootnoteText"/>
-      </w:pPr>
-      <w:r>
-        <w:rPr>
-          <w:rStyle w:val="FootnoteReference"/>
-          <w:rFonts w:ascii="Times New Roman" w:cs="Times New Roman" w:eastAsia="Times New Roman" w:hAnsi="Times New Roman"/>
-          <w:sz w:val="20"/>
-          <w:szCs w:val="20"/>
-          <w:vertAlign w:val="superscript"/>
-        </w:rPr>
-        <w:footnoteRef/>
-      </w:r>
-      <w:r>
-        <w:rPr>
-          <w:rFonts w:ascii="Times New Roman" w:cs="Times New Roman" w:eastAsia="Times New Roman" w:hAnsi="Times New Roman"/>
-          <w:sz w:val="20"/>
-          <w:szCs w:val="20"/>
-        </w:rPr>
-        <w:t xml:space="preserve"> </w:t>
-      </w:r>
-      <w:r>
-        <w:rPr>
-          <w:rFonts w:ascii="Times New Roman" w:cs="Times New Roman" w:eastAsia="Times New Roman" w:hAnsi="Times New Roman"/>
-          <w:sz w:val="20"/>
-          <w:szCs w:val="20"/>
-        </w:rPr>
-        <w:t xml:space="preserve">Geneva International Centre for Justice, 'UPR 4th Cycle: Human Rights in Pakistan – Progress Amid Challenges' &lt;https://www.gicj.org/conferences-meetings/upr-sessions/3231-upr-4th-cycle-human-rights-in-pakistan-progress-amid-challenges&gt; accessed 1 October 2026; Office of the United Nations High Commissioner for Human Rights, 'Pakistan: The Universal Periodic Review, 4th Cycle' (infographic) &lt;https://www.ohchr.org/sites/default/files/documents/hrbodies/upr/sessions/session42/pk/Infographics-4thcycle-Pakistan.pdf&gt; accessed 1 October 2026.</w:t>
-      </w:r>
-    </w:p>
-  </w:footnote>
-  <w:footnote w:id="19">
-    <w:p>
-      <w:pPr>
-        <w:pStyle w:val="FootnoteText"/>
-      </w:pPr>
-      <w:r>
-        <w:rPr>
-          <w:rStyle w:val="FootnoteReference"/>
-          <w:rFonts w:ascii="Times New Roman" w:cs="Times New Roman" w:eastAsia="Times New Roman" w:hAnsi="Times New Roman"/>
-          <w:sz w:val="20"/>
-          <w:szCs w:val="20"/>
-          <w:vertAlign w:val="superscript"/>
-        </w:rPr>
-        <w:footnoteRef/>
-      </w:r>
-      <w:r>
-        <w:rPr>
-          <w:rFonts w:ascii="Times New Roman" w:cs="Times New Roman" w:eastAsia="Times New Roman" w:hAnsi="Times New Roman"/>
-          <w:sz w:val="20"/>
-          <w:szCs w:val="20"/>
-        </w:rPr>
-        <w:t xml:space="preserve"> </w:t>
-      </w:r>
-      <w:r>
-        <w:rPr>
-          <w:rFonts w:ascii="Times New Roman" w:cs="Times New Roman" w:eastAsia="Times New Roman" w:hAnsi="Times New Roman"/>
-          <w:sz w:val="20"/>
-          <w:szCs w:val="20"/>
-        </w:rPr>
-        <w:t xml:space="preserve">Naveed-ur-Rehman, Chaudhry and Niazi (n 1).</w:t>
-      </w:r>
-    </w:p>
-  </w:footnote>
-  <w:footnote w:id="20">
-    <w:p>
-      <w:pPr>
-        <w:pStyle w:val="FootnoteText"/>
-      </w:pPr>
-      <w:r>
-        <w:rPr>
-          <w:rStyle w:val="FootnoteReference"/>
-          <w:rFonts w:ascii="Times New Roman" w:cs="Times New Roman" w:eastAsia="Times New Roman" w:hAnsi="Times New Roman"/>
-          <w:sz w:val="20"/>
-          <w:szCs w:val="20"/>
-          <w:vertAlign w:val="superscript"/>
-        </w:rPr>
-        <w:footnoteRef/>
-      </w:r>
-      <w:r>
-        <w:rPr>
-          <w:rFonts w:ascii="Times New Roman" w:cs="Times New Roman" w:eastAsia="Times New Roman" w:hAnsi="Times New Roman"/>
-          <w:sz w:val="20"/>
-          <w:szCs w:val="20"/>
-        </w:rPr>
-        <w:t xml:space="preserve"> </w:t>
-      </w:r>
-      <w:r>
-        <w:rPr>
-          <w:rFonts w:ascii="Times New Roman" w:cs="Times New Roman" w:eastAsia="Times New Roman" w:hAnsi="Times New Roman"/>
-          <w:sz w:val="20"/>
-          <w:szCs w:val="20"/>
-        </w:rPr>
-        <w:t xml:space="preserve">Parliamentarians for Global Action, '45th Annual Forum and 13th Consultative Assembly of Parliamentarians on the International Criminal Court and the Rule of Law (CAP-ICC) in Islamabad, Pakistan' &lt;https://www.pgaction.org/news/cap-icc-xiii-45th-annual-forum.html&gt; accessed 1 October 2026; National Assembly of Pakistan, 'The 45th Annual Forum of Parliamentarians for Global Action (PGA) and the 13th Session of the Consultative Assembly of Parliamentarians (CAP-ICC) will be held on 28th and 29th October 2024 in Islamabad' (Press release) &lt;https://na.gov.pk/en/pressrelease_detail.php?id=6376&gt; accessed 1 October 2026.</w:t>
-      </w:r>
-    </w:p>
-  </w:footnote>
-  <w:footnote w:id="21">
-    <w:p>
-      <w:pPr>
-        <w:pStyle w:val="FootnoteText"/>
-      </w:pPr>
-      <w:r>
-        <w:rPr>
-          <w:rStyle w:val="FootnoteReference"/>
-          <w:rFonts w:ascii="Times New Roman" w:cs="Times New Roman" w:eastAsia="Times New Roman" w:hAnsi="Times New Roman"/>
-          <w:sz w:val="20"/>
-          <w:szCs w:val="20"/>
-          <w:vertAlign w:val="superscript"/>
-        </w:rPr>
-        <w:footnoteRef/>
-      </w:r>
-      <w:r>
-        <w:rPr>
-          <w:rFonts w:ascii="Times New Roman" w:cs="Times New Roman" w:eastAsia="Times New Roman" w:hAnsi="Times New Roman"/>
-          <w:sz w:val="20"/>
-          <w:szCs w:val="20"/>
-        </w:rPr>
-        <w:t xml:space="preserve"> </w:t>
-      </w:r>
-      <w:r>
-        <w:rPr>
-          <w:rFonts w:ascii="Times New Roman" w:cs="Times New Roman" w:eastAsia="Times New Roman" w:hAnsi="Times New Roman"/>
-          <w:sz w:val="20"/>
-          <w:szCs w:val="20"/>
-        </w:rPr>
-        <w:t xml:space="preserve">Parliamentarians for Global Action (n 20).</w:t>
-      </w:r>
-    </w:p>
-  </w:footnote>
-  <w:footnote w:id="22">
-    <w:p>
-      <w:pPr>
-        <w:pStyle w:val="FootnoteText"/>
-      </w:pPr>
-      <w:r>
-        <w:rPr>
-          <w:rStyle w:val="FootnoteReference"/>
-          <w:rFonts w:ascii="Times New Roman" w:cs="Times New Roman" w:eastAsia="Times New Roman" w:hAnsi="Times New Roman"/>
-          <w:sz w:val="20"/>
-          <w:szCs w:val="20"/>
-          <w:vertAlign w:val="superscript"/>
-        </w:rPr>
-        <w:footnoteRef/>
-      </w:r>
-      <w:r>
-        <w:rPr>
-          <w:rFonts w:ascii="Times New Roman" w:cs="Times New Roman" w:eastAsia="Times New Roman" w:hAnsi="Times New Roman"/>
-          <w:sz w:val="20"/>
-          <w:szCs w:val="20"/>
-        </w:rPr>
-        <w:t xml:space="preserve"> </w:t>
-      </w:r>
-      <w:r>
-        <w:rPr>
-          <w:rFonts w:ascii="Times New Roman" w:cs="Times New Roman" w:eastAsia="Times New Roman" w:hAnsi="Times New Roman"/>
-          <w:sz w:val="20"/>
-          <w:szCs w:val="20"/>
-        </w:rPr>
-        <w:t xml:space="preserve">Parliamentarians for Global Action (n 20).</w:t>
-      </w:r>
-    </w:p>
-  </w:footnote>
   <w:footnote w:id="23">
     <w:p>
       <w:pPr>
@@ -1774,73 +2074,7 @@
           <w:sz w:val="20"/>
           <w:szCs w:val="20"/>
         </w:rPr>
-        <w:t xml:space="preserve">International Criminal Court, 'Situation in the State of Palestine: ICC Pre-Trial Chamber I rejects the State of Israel's challenges to jurisdiction and issues warrants of arrest for Benjamin Netanyahu and Yoav Gallant' (Press release, 21 November 2024) &lt;https://www.icc-cpi.int/news/situation-state-palestine-icc-pre-trial-chamber-i-rejects-state-israels-challenges&gt; accessed 1 October 2026.</w:t>
-      </w:r>
-    </w:p>
-  </w:footnote>
-  <w:footnote w:id="24">
-    <w:p>
-      <w:pPr>
-        <w:pStyle w:val="FootnoteText"/>
-      </w:pPr>
-      <w:r>
-        <w:rPr>
-          <w:rStyle w:val="FootnoteReference"/>
-          <w:rFonts w:ascii="Times New Roman" w:cs="Times New Roman" w:eastAsia="Times New Roman" w:hAnsi="Times New Roman"/>
-          <w:sz w:val="20"/>
-          <w:szCs w:val="20"/>
-          <w:vertAlign w:val="superscript"/>
-        </w:rPr>
-        <w:footnoteRef/>
-      </w:r>
-      <w:r>
-        <w:rPr>
-          <w:rFonts w:ascii="Times New Roman" w:cs="Times New Roman" w:eastAsia="Times New Roman" w:hAnsi="Times New Roman"/>
-          <w:sz w:val="20"/>
-          <w:szCs w:val="20"/>
-        </w:rPr>
-        <w:t xml:space="preserve"> </w:t>
-      </w:r>
-      <w:r>
-        <w:rPr>
-          <w:rFonts w:ascii="Times New Roman" w:cs="Times New Roman" w:eastAsia="Times New Roman" w:hAnsi="Times New Roman"/>
-          <w:sz w:val="20"/>
-          <w:szCs w:val="20"/>
-        </w:rPr>
-        <w:t xml:space="preserve">Parliamentarians for Global Action, 'Parliamentarians Demand Progress on the Crime of Aggression' &lt;https://www.pgaction.org/news/demand-progress-crime-aggression.html&gt; accessed 1 October 2026; International Criminal Court, 'Assembly of States Parties held a three-day special session on the review of amendments of the crime of aggression' &lt;https://www.icc-cpi.int/news/assembly-states-parties-held-three-day-special-session-review-amendments-crime-aggression&gt; accessed 1 October 2026. The special session was held at United Nations Headquarters, New York, on 7–9 July 2025. Mr Qamar is the President of Parliamentarians for Global Action.</w:t>
-      </w:r>
-    </w:p>
-  </w:footnote>
-  <w:footnote w:id="25">
-    <w:p>
-      <w:pPr>
-        <w:pStyle w:val="FootnoteText"/>
-      </w:pPr>
-      <w:r>
-        <w:rPr>
-          <w:rStyle w:val="FootnoteReference"/>
-          <w:rFonts w:ascii="Times New Roman" w:cs="Times New Roman" w:eastAsia="Times New Roman" w:hAnsi="Times New Roman"/>
-          <w:sz w:val="20"/>
-          <w:szCs w:val="20"/>
-          <w:vertAlign w:val="superscript"/>
-        </w:rPr>
-        <w:footnoteRef/>
-      </w:r>
-      <w:r>
-        <w:rPr>
-          <w:rFonts w:ascii="Times New Roman" w:cs="Times New Roman" w:eastAsia="Times New Roman" w:hAnsi="Times New Roman"/>
-          <w:sz w:val="20"/>
-          <w:szCs w:val="20"/>
-        </w:rPr>
-        <w:t xml:space="preserve"> </w:t>
-      </w:r>
-      <w:r>
-        <w:rPr>
-          <w:rFonts w:ascii="Times New Roman" w:cs="Times New Roman" w:eastAsia="Times New Roman" w:hAnsi="Times New Roman"/>
-          <w:sz w:val="20"/>
-          <w:szCs w:val="20"/>
-        </w:rPr>
-        <w:t xml:space="preserve">'"US should kidnap him": Khawaja Asif wishes Maduro like fate on Israel PM Netanyahu, video goes viral' </w:t>
+        <w:t xml:space="preserve">'Pakistan can't take Kashmir to ICJ, says law minister' </w:t>
       </w:r>
       <w:r>
         <w:rPr>
@@ -1850,15 +2084,510 @@
           <w:sz w:val="20"/>
           <w:szCs w:val="20"/>
         </w:rPr>
-        <w:t xml:space="preserve">Business Today</w:t>
-      </w:r>
-      <w:r>
-        <w:rPr>
-          <w:rFonts w:ascii="Times New Roman" w:cs="Times New Roman" w:eastAsia="Times New Roman" w:hAnsi="Times New Roman"/>
-          <w:sz w:val="20"/>
-          <w:szCs w:val="20"/>
-        </w:rPr>
-        <w:t xml:space="preserve"> (10 January 2026) &lt;https://www.businesstoday.in/india/story/us-should-kidnap-him-khawaja-asif-wishes-maduro-like-fate-on-israel-pm-netanyahu-video-goes-viral-510314-2026-01-10&gt; accessed 1 October 2026; 'When Pakistan Defence Minister calls for Netanyahu's "kidnapping" like Maduro, interview cut short on Live TV' </w:t>
+        <w:t xml:space="preserve">Pakistan Today</w:t>
+      </w:r>
+      <w:r>
+        <w:rPr>
+          <w:rFonts w:ascii="Times New Roman" w:cs="Times New Roman" w:eastAsia="Times New Roman" w:hAnsi="Times New Roman"/>
+          <w:sz w:val="20"/>
+          <w:szCs w:val="20"/>
+        </w:rPr>
+        <w:t xml:space="preserve"> (Lahore, 14 September 2019) &lt;https://archive.pakistantoday.com.pk/2019/09/14/pakistan-cant-take-kashmir-to-icj-says-law-minister/&gt; accessed 1 October 2026. Law Minister Farogh Naseem explained that Pakistan could not bring the dispute before the ICJ unilaterally, without India's consent.</w:t>
+      </w:r>
+    </w:p>
+  </w:footnote>
+  <w:footnote w:id="24">
+    <w:p>
+      <w:pPr>
+        <w:pStyle w:val="FootnoteText"/>
+      </w:pPr>
+      <w:r>
+        <w:rPr>
+          <w:rStyle w:val="FootnoteReference"/>
+          <w:rFonts w:ascii="Times New Roman" w:cs="Times New Roman" w:eastAsia="Times New Roman" w:hAnsi="Times New Roman"/>
+          <w:sz w:val="20"/>
+          <w:szCs w:val="20"/>
+          <w:vertAlign w:val="superscript"/>
+        </w:rPr>
+        <w:footnoteRef/>
+      </w:r>
+      <w:r>
+        <w:rPr>
+          <w:rFonts w:ascii="Times New Roman" w:cs="Times New Roman" w:eastAsia="Times New Roman" w:hAnsi="Times New Roman"/>
+          <w:sz w:val="20"/>
+          <w:szCs w:val="20"/>
+        </w:rPr>
+        <w:t xml:space="preserve"> </w:t>
+      </w:r>
+      <w:r>
+        <w:rPr>
+          <w:rFonts w:ascii="Times New Roman" w:cs="Times New Roman" w:eastAsia="Times New Roman" w:hAnsi="Times New Roman"/>
+          <w:sz w:val="20"/>
+          <w:szCs w:val="20"/>
+        </w:rPr>
+        <w:t xml:space="preserve">Rome Statute (n 4) arts 12–13. A non-party State may also accept the Court's jurisdiction by declaration under art 12(3), but only over crimes committed on its own territory or by its own nationals, so a declaration by Pakistan could not reach conduct by Indian nationals on territory administered by India.</w:t>
+      </w:r>
+    </w:p>
+  </w:footnote>
+  <w:footnote w:id="25">
+    <w:p>
+      <w:pPr>
+        <w:pStyle w:val="FootnoteText"/>
+      </w:pPr>
+      <w:r>
+        <w:rPr>
+          <w:rStyle w:val="FootnoteReference"/>
+          <w:rFonts w:ascii="Times New Roman" w:cs="Times New Roman" w:eastAsia="Times New Roman" w:hAnsi="Times New Roman"/>
+          <w:sz w:val="20"/>
+          <w:szCs w:val="20"/>
+          <w:vertAlign w:val="superscript"/>
+        </w:rPr>
+        <w:footnoteRef/>
+      </w:r>
+      <w:r>
+        <w:rPr>
+          <w:rFonts w:ascii="Times New Roman" w:cs="Times New Roman" w:eastAsia="Times New Roman" w:hAnsi="Times New Roman"/>
+          <w:sz w:val="20"/>
+          <w:szCs w:val="20"/>
+        </w:rPr>
+        <w:t xml:space="preserve"> </w:t>
+      </w:r>
+      <w:r>
+        <w:rPr>
+          <w:rFonts w:ascii="Times New Roman" w:cs="Times New Roman" w:eastAsia="Times New Roman" w:hAnsi="Times New Roman"/>
+          <w:sz w:val="20"/>
+          <w:szCs w:val="20"/>
+        </w:rPr>
+        <w:t xml:space="preserve">Khan (n 2).</w:t>
+      </w:r>
+    </w:p>
+  </w:footnote>
+  <w:footnote w:id="26">
+    <w:p>
+      <w:pPr>
+        <w:pStyle w:val="FootnoteText"/>
+      </w:pPr>
+      <w:r>
+        <w:rPr>
+          <w:rStyle w:val="FootnoteReference"/>
+          <w:rFonts w:ascii="Times New Roman" w:cs="Times New Roman" w:eastAsia="Times New Roman" w:hAnsi="Times New Roman"/>
+          <w:sz w:val="20"/>
+          <w:szCs w:val="20"/>
+          <w:vertAlign w:val="superscript"/>
+        </w:rPr>
+        <w:footnoteRef/>
+      </w:r>
+      <w:r>
+        <w:rPr>
+          <w:rFonts w:ascii="Times New Roman" w:cs="Times New Roman" w:eastAsia="Times New Roman" w:hAnsi="Times New Roman"/>
+          <w:sz w:val="20"/>
+          <w:szCs w:val="20"/>
+        </w:rPr>
+        <w:t xml:space="preserve"> </w:t>
+      </w:r>
+      <w:r>
+        <w:rPr>
+          <w:rFonts w:ascii="Times New Roman" w:cs="Times New Roman" w:eastAsia="Times New Roman" w:hAnsi="Times New Roman"/>
+          <w:sz w:val="20"/>
+          <w:szCs w:val="20"/>
+        </w:rPr>
+        <w:t xml:space="preserve">Office of the United Nations High Commissioner for Human Rights, 'Pakistan's human rights record to be examined by Universal Periodic Review' (Press release, January 2023) &lt;https://www.ohchr.org/en/press-releases/2023/01/pakistans-human-rights-record-be-examined-universal-periodic-review&gt; accessed 1 October 2026. The review took place on 30 January 2023.</w:t>
+      </w:r>
+    </w:p>
+  </w:footnote>
+  <w:footnote w:id="27">
+    <w:p>
+      <w:pPr>
+        <w:pStyle w:val="FootnoteText"/>
+      </w:pPr>
+      <w:r>
+        <w:rPr>
+          <w:rStyle w:val="FootnoteReference"/>
+          <w:rFonts w:ascii="Times New Roman" w:cs="Times New Roman" w:eastAsia="Times New Roman" w:hAnsi="Times New Roman"/>
+          <w:sz w:val="20"/>
+          <w:szCs w:val="20"/>
+          <w:vertAlign w:val="superscript"/>
+        </w:rPr>
+        <w:footnoteRef/>
+      </w:r>
+      <w:r>
+        <w:rPr>
+          <w:rFonts w:ascii="Times New Roman" w:cs="Times New Roman" w:eastAsia="Times New Roman" w:hAnsi="Times New Roman"/>
+          <w:sz w:val="20"/>
+          <w:szCs w:val="20"/>
+        </w:rPr>
+        <w:t xml:space="preserve"> </w:t>
+      </w:r>
+      <w:r>
+        <w:rPr>
+          <w:rFonts w:ascii="Times New Roman" w:cs="Times New Roman" w:eastAsia="Times New Roman" w:hAnsi="Times New Roman"/>
+          <w:sz w:val="20"/>
+          <w:szCs w:val="20"/>
+        </w:rPr>
+        <w:t xml:space="preserve">Geneva International Centre for Justice, 'UPR 4th Cycle: Human Rights in Pakistan – Progress Amid Challenges' &lt;https://www.gicj.org/conferences-meetings/upr-sessions/3231-upr-4th-cycle-human-rights-in-pakistan-progress-amid-challenges&gt; accessed 1 October 2026.</w:t>
+      </w:r>
+    </w:p>
+  </w:footnote>
+  <w:footnote w:id="28">
+    <w:p>
+      <w:pPr>
+        <w:pStyle w:val="FootnoteText"/>
+      </w:pPr>
+      <w:r>
+        <w:rPr>
+          <w:rStyle w:val="FootnoteReference"/>
+          <w:rFonts w:ascii="Times New Roman" w:cs="Times New Roman" w:eastAsia="Times New Roman" w:hAnsi="Times New Roman"/>
+          <w:sz w:val="20"/>
+          <w:szCs w:val="20"/>
+          <w:vertAlign w:val="superscript"/>
+        </w:rPr>
+        <w:footnoteRef/>
+      </w:r>
+      <w:r>
+        <w:rPr>
+          <w:rFonts w:ascii="Times New Roman" w:cs="Times New Roman" w:eastAsia="Times New Roman" w:hAnsi="Times New Roman"/>
+          <w:sz w:val="20"/>
+          <w:szCs w:val="20"/>
+        </w:rPr>
+        <w:t xml:space="preserve"> </w:t>
+      </w:r>
+      <w:r>
+        <w:rPr>
+          <w:rFonts w:ascii="Times New Roman" w:cs="Times New Roman" w:eastAsia="Times New Roman" w:hAnsi="Times New Roman"/>
+          <w:sz w:val="20"/>
+          <w:szCs w:val="20"/>
+        </w:rPr>
+        <w:t xml:space="preserve">Office of the United Nations High Commissioner for Human Rights, 'Pakistan: The Universal Periodic Review, 4th Cycle' (infographic) &lt;https://www.ohchr.org/sites/default/files/documents/hrbodies/upr/sessions/session42/pk/Infographics-4thcycle-Pakistan.pdf&gt; accessed 1 October 2026; Office of the United Nations High Commissioner for Human Rights, 'Human Rights Council Adopts Universal Periodic Review Outcomes of Pakistan, Japan and Sri Lanka' (July 2023) &lt;https://www.ohchr.org/en/news/2023/07/human-rights-council-adopts-universal-periodic-review-outcomes-pakistan-japan-and-sri&gt; accessed 1 October 2026.</w:t>
+      </w:r>
+    </w:p>
+  </w:footnote>
+  <w:footnote w:id="29">
+    <w:p>
+      <w:pPr>
+        <w:pStyle w:val="FootnoteText"/>
+      </w:pPr>
+      <w:r>
+        <w:rPr>
+          <w:rStyle w:val="FootnoteReference"/>
+          <w:rFonts w:ascii="Times New Roman" w:cs="Times New Roman" w:eastAsia="Times New Roman" w:hAnsi="Times New Roman"/>
+          <w:sz w:val="20"/>
+          <w:szCs w:val="20"/>
+          <w:vertAlign w:val="superscript"/>
+        </w:rPr>
+        <w:footnoteRef/>
+      </w:r>
+      <w:r>
+        <w:rPr>
+          <w:rFonts w:ascii="Times New Roman" w:cs="Times New Roman" w:eastAsia="Times New Roman" w:hAnsi="Times New Roman"/>
+          <w:sz w:val="20"/>
+          <w:szCs w:val="20"/>
+        </w:rPr>
+        <w:t xml:space="preserve"> </w:t>
+      </w:r>
+      <w:r>
+        <w:rPr>
+          <w:rFonts w:ascii="Times New Roman" w:cs="Times New Roman" w:eastAsia="Times New Roman" w:hAnsi="Times New Roman"/>
+          <w:sz w:val="20"/>
+          <w:szCs w:val="20"/>
+        </w:rPr>
+        <w:t xml:space="preserve">Assembly of States Parties (n 1).</w:t>
+      </w:r>
+    </w:p>
+  </w:footnote>
+  <w:footnote w:id="30">
+    <w:p>
+      <w:pPr>
+        <w:pStyle w:val="FootnoteText"/>
+      </w:pPr>
+      <w:r>
+        <w:rPr>
+          <w:rStyle w:val="FootnoteReference"/>
+          <w:rFonts w:ascii="Times New Roman" w:cs="Times New Roman" w:eastAsia="Times New Roman" w:hAnsi="Times New Roman"/>
+          <w:sz w:val="20"/>
+          <w:szCs w:val="20"/>
+          <w:vertAlign w:val="superscript"/>
+        </w:rPr>
+        <w:footnoteRef/>
+      </w:r>
+      <w:r>
+        <w:rPr>
+          <w:rFonts w:ascii="Times New Roman" w:cs="Times New Roman" w:eastAsia="Times New Roman" w:hAnsi="Times New Roman"/>
+          <w:sz w:val="20"/>
+          <w:szCs w:val="20"/>
+        </w:rPr>
+        <w:t xml:space="preserve"> </w:t>
+      </w:r>
+      <w:r>
+        <w:rPr>
+          <w:rFonts w:ascii="Times New Roman" w:cs="Times New Roman" w:eastAsia="Times New Roman" w:hAnsi="Times New Roman"/>
+          <w:sz w:val="20"/>
+          <w:szCs w:val="20"/>
+        </w:rPr>
+        <w:t xml:space="preserve">Naveed-ur-Rehman, Chaudhry and Niazi (n 2).</w:t>
+      </w:r>
+    </w:p>
+  </w:footnote>
+  <w:footnote w:id="31">
+    <w:p>
+      <w:pPr>
+        <w:pStyle w:val="FootnoteText"/>
+      </w:pPr>
+      <w:r>
+        <w:rPr>
+          <w:rStyle w:val="FootnoteReference"/>
+          <w:rFonts w:ascii="Times New Roman" w:cs="Times New Roman" w:eastAsia="Times New Roman" w:hAnsi="Times New Roman"/>
+          <w:sz w:val="20"/>
+          <w:szCs w:val="20"/>
+          <w:vertAlign w:val="superscript"/>
+        </w:rPr>
+        <w:footnoteRef/>
+      </w:r>
+      <w:r>
+        <w:rPr>
+          <w:rFonts w:ascii="Times New Roman" w:cs="Times New Roman" w:eastAsia="Times New Roman" w:hAnsi="Times New Roman"/>
+          <w:sz w:val="20"/>
+          <w:szCs w:val="20"/>
+        </w:rPr>
+        <w:t xml:space="preserve"> </w:t>
+      </w:r>
+      <w:r>
+        <w:rPr>
+          <w:rFonts w:ascii="Times New Roman" w:cs="Times New Roman" w:eastAsia="Times New Roman" w:hAnsi="Times New Roman"/>
+          <w:sz w:val="20"/>
+          <w:szCs w:val="20"/>
+        </w:rPr>
+        <w:t xml:space="preserve">Parliamentarians for Global Action, '45th Annual Forum and 13th Consultative Assembly of Parliamentarians on the International Criminal Court and the Rule of Law (CAP-ICC) in Islamabad, Pakistan' &lt;https://www.pgaction.org/news/cap-icc-xiii-45th-annual-forum.html&gt; accessed 1 October 2026; National Assembly of Pakistan, 'The 45th Annual Forum of Parliamentarians for Global Action (PGA) and the 13th Session of the Consultative Assembly of Parliamentarians (CAP-ICC) will be held on 28th and 29th October 2024 in Islamabad' (Press release) &lt;https://na.gov.pk/en/pressrelease_detail.php?id=6376&gt; accessed 1 October 2026.</w:t>
+      </w:r>
+    </w:p>
+  </w:footnote>
+  <w:footnote w:id="32">
+    <w:p>
+      <w:pPr>
+        <w:pStyle w:val="FootnoteText"/>
+      </w:pPr>
+      <w:r>
+        <w:rPr>
+          <w:rStyle w:val="FootnoteReference"/>
+          <w:rFonts w:ascii="Times New Roman" w:cs="Times New Roman" w:eastAsia="Times New Roman" w:hAnsi="Times New Roman"/>
+          <w:sz w:val="20"/>
+          <w:szCs w:val="20"/>
+          <w:vertAlign w:val="superscript"/>
+        </w:rPr>
+        <w:footnoteRef/>
+      </w:r>
+      <w:r>
+        <w:rPr>
+          <w:rFonts w:ascii="Times New Roman" w:cs="Times New Roman" w:eastAsia="Times New Roman" w:hAnsi="Times New Roman"/>
+          <w:sz w:val="20"/>
+          <w:szCs w:val="20"/>
+        </w:rPr>
+        <w:t xml:space="preserve"> </w:t>
+      </w:r>
+      <w:r>
+        <w:rPr>
+          <w:rFonts w:ascii="Times New Roman" w:cs="Times New Roman" w:eastAsia="Times New Roman" w:hAnsi="Times New Roman"/>
+          <w:sz w:val="20"/>
+          <w:szCs w:val="20"/>
+        </w:rPr>
+        <w:t xml:space="preserve">Parliamentarians for Global Action (n 31).</w:t>
+      </w:r>
+    </w:p>
+  </w:footnote>
+  <w:footnote w:id="33">
+    <w:p>
+      <w:pPr>
+        <w:pStyle w:val="FootnoteText"/>
+      </w:pPr>
+      <w:r>
+        <w:rPr>
+          <w:rStyle w:val="FootnoteReference"/>
+          <w:rFonts w:ascii="Times New Roman" w:cs="Times New Roman" w:eastAsia="Times New Roman" w:hAnsi="Times New Roman"/>
+          <w:sz w:val="20"/>
+          <w:szCs w:val="20"/>
+          <w:vertAlign w:val="superscript"/>
+        </w:rPr>
+        <w:footnoteRef/>
+      </w:r>
+      <w:r>
+        <w:rPr>
+          <w:rFonts w:ascii="Times New Roman" w:cs="Times New Roman" w:eastAsia="Times New Roman" w:hAnsi="Times New Roman"/>
+          <w:sz w:val="20"/>
+          <w:szCs w:val="20"/>
+        </w:rPr>
+        <w:t xml:space="preserve"> </w:t>
+      </w:r>
+      <w:r>
+        <w:rPr>
+          <w:rFonts w:ascii="Times New Roman" w:cs="Times New Roman" w:eastAsia="Times New Roman" w:hAnsi="Times New Roman"/>
+          <w:sz w:val="20"/>
+          <w:szCs w:val="20"/>
+        </w:rPr>
+        <w:t xml:space="preserve">Parliamentarians for Global Action (n 31).</w:t>
+      </w:r>
+    </w:p>
+  </w:footnote>
+  <w:footnote w:id="34">
+    <w:p>
+      <w:pPr>
+        <w:pStyle w:val="FootnoteText"/>
+      </w:pPr>
+      <w:r>
+        <w:rPr>
+          <w:rStyle w:val="FootnoteReference"/>
+          <w:rFonts w:ascii="Times New Roman" w:cs="Times New Roman" w:eastAsia="Times New Roman" w:hAnsi="Times New Roman"/>
+          <w:sz w:val="20"/>
+          <w:szCs w:val="20"/>
+          <w:vertAlign w:val="superscript"/>
+        </w:rPr>
+        <w:footnoteRef/>
+      </w:r>
+      <w:r>
+        <w:rPr>
+          <w:rFonts w:ascii="Times New Roman" w:cs="Times New Roman" w:eastAsia="Times New Roman" w:hAnsi="Times New Roman"/>
+          <w:sz w:val="20"/>
+          <w:szCs w:val="20"/>
+        </w:rPr>
+        <w:t xml:space="preserve"> </w:t>
+      </w:r>
+      <w:r>
+        <w:rPr>
+          <w:rFonts w:ascii="Times New Roman" w:cs="Times New Roman" w:eastAsia="Times New Roman" w:hAnsi="Times New Roman"/>
+          <w:sz w:val="20"/>
+          <w:szCs w:val="20"/>
+        </w:rPr>
+        <w:t xml:space="preserve">Parliamentarians for Global Action (n 31).</w:t>
+      </w:r>
+    </w:p>
+  </w:footnote>
+  <w:footnote w:id="35">
+    <w:p>
+      <w:pPr>
+        <w:pStyle w:val="FootnoteText"/>
+      </w:pPr>
+      <w:r>
+        <w:rPr>
+          <w:rStyle w:val="FootnoteReference"/>
+          <w:rFonts w:ascii="Times New Roman" w:cs="Times New Roman" w:eastAsia="Times New Roman" w:hAnsi="Times New Roman"/>
+          <w:sz w:val="20"/>
+          <w:szCs w:val="20"/>
+          <w:vertAlign w:val="superscript"/>
+        </w:rPr>
+        <w:footnoteRef/>
+      </w:r>
+      <w:r>
+        <w:rPr>
+          <w:rFonts w:ascii="Times New Roman" w:cs="Times New Roman" w:eastAsia="Times New Roman" w:hAnsi="Times New Roman"/>
+          <w:sz w:val="20"/>
+          <w:szCs w:val="20"/>
+        </w:rPr>
+        <w:t xml:space="preserve"> </w:t>
+      </w:r>
+      <w:r>
+        <w:rPr>
+          <w:rFonts w:ascii="Times New Roman" w:cs="Times New Roman" w:eastAsia="Times New Roman" w:hAnsi="Times New Roman"/>
+          <w:sz w:val="20"/>
+          <w:szCs w:val="20"/>
+        </w:rPr>
+        <w:t xml:space="preserve">International Criminal Court, 'Situation in the State of Palestine: ICC Pre-Trial Chamber I rejects the State of Israel's challenges to jurisdiction and issues warrants of arrest for Benjamin Netanyahu and Yoav Gallant' (Press release, 21 November 2024) &lt;https://www.icc-cpi.int/news/situation-state-palestine-icc-pre-trial-chamber-i-rejects-state-israels-challenges&gt; accessed 1 October 2026.</w:t>
+      </w:r>
+    </w:p>
+  </w:footnote>
+  <w:footnote w:id="36">
+    <w:p>
+      <w:pPr>
+        <w:pStyle w:val="FootnoteText"/>
+      </w:pPr>
+      <w:r>
+        <w:rPr>
+          <w:rStyle w:val="FootnoteReference"/>
+          <w:rFonts w:ascii="Times New Roman" w:cs="Times New Roman" w:eastAsia="Times New Roman" w:hAnsi="Times New Roman"/>
+          <w:sz w:val="20"/>
+          <w:szCs w:val="20"/>
+          <w:vertAlign w:val="superscript"/>
+        </w:rPr>
+        <w:footnoteRef/>
+      </w:r>
+      <w:r>
+        <w:rPr>
+          <w:rFonts w:ascii="Times New Roman" w:cs="Times New Roman" w:eastAsia="Times New Roman" w:hAnsi="Times New Roman"/>
+          <w:sz w:val="20"/>
+          <w:szCs w:val="20"/>
+        </w:rPr>
+        <w:t xml:space="preserve"> </w:t>
+      </w:r>
+      <w:r>
+        <w:rPr>
+          <w:rFonts w:ascii="Times New Roman" w:cs="Times New Roman" w:eastAsia="Times New Roman" w:hAnsi="Times New Roman"/>
+          <w:sz w:val="20"/>
+          <w:szCs w:val="20"/>
+        </w:rPr>
+        <w:t xml:space="preserve">See the text to n 38 below.</w:t>
+      </w:r>
+    </w:p>
+  </w:footnote>
+  <w:footnote w:id="37">
+    <w:p>
+      <w:pPr>
+        <w:pStyle w:val="FootnoteText"/>
+      </w:pPr>
+      <w:r>
+        <w:rPr>
+          <w:rStyle w:val="FootnoteReference"/>
+          <w:rFonts w:ascii="Times New Roman" w:cs="Times New Roman" w:eastAsia="Times New Roman" w:hAnsi="Times New Roman"/>
+          <w:sz w:val="20"/>
+          <w:szCs w:val="20"/>
+          <w:vertAlign w:val="superscript"/>
+        </w:rPr>
+        <w:footnoteRef/>
+      </w:r>
+      <w:r>
+        <w:rPr>
+          <w:rFonts w:ascii="Times New Roman" w:cs="Times New Roman" w:eastAsia="Times New Roman" w:hAnsi="Times New Roman"/>
+          <w:sz w:val="20"/>
+          <w:szCs w:val="20"/>
+        </w:rPr>
+        <w:t xml:space="preserve"> </w:t>
+      </w:r>
+      <w:r>
+        <w:rPr>
+          <w:rFonts w:ascii="Times New Roman" w:cs="Times New Roman" w:eastAsia="Times New Roman" w:hAnsi="Times New Roman"/>
+          <w:sz w:val="20"/>
+          <w:szCs w:val="20"/>
+        </w:rPr>
+        <w:t xml:space="preserve">Parliamentarians for Global Action, 'Parliamentarians Demand Progress on the Crime of Aggression' &lt;https://www.pgaction.org/news/demand-progress-crime-aggression.html&gt; accessed 1 October 2026; International Criminal Court, 'Assembly of States Parties held a three-day special session on the review of amendments of the crime of aggression' &lt;https://www.icc-cpi.int/news/assembly-states-parties-held-three-day-special-session-review-amendments-crime-aggression&gt; accessed 1 October 2026. The special session was held at United Nations Headquarters, New York, on 7–9 July 2025. Mr Qamar is the President of Parliamentarians for Global Action.</w:t>
+      </w:r>
+    </w:p>
+  </w:footnote>
+  <w:footnote w:id="38">
+    <w:p>
+      <w:pPr>
+        <w:pStyle w:val="FootnoteText"/>
+      </w:pPr>
+      <w:r>
+        <w:rPr>
+          <w:rStyle w:val="FootnoteReference"/>
+          <w:rFonts w:ascii="Times New Roman" w:cs="Times New Roman" w:eastAsia="Times New Roman" w:hAnsi="Times New Roman"/>
+          <w:sz w:val="20"/>
+          <w:szCs w:val="20"/>
+          <w:vertAlign w:val="superscript"/>
+        </w:rPr>
+        <w:footnoteRef/>
+      </w:r>
+      <w:r>
+        <w:rPr>
+          <w:rFonts w:ascii="Times New Roman" w:cs="Times New Roman" w:eastAsia="Times New Roman" w:hAnsi="Times New Roman"/>
+          <w:sz w:val="20"/>
+          <w:szCs w:val="20"/>
+        </w:rPr>
+        <w:t xml:space="preserve"> </w:t>
+      </w:r>
+      <w:r>
+        <w:rPr>
+          <w:rFonts w:ascii="Times New Roman" w:cs="Times New Roman" w:eastAsia="Times New Roman" w:hAnsi="Times New Roman"/>
+          <w:sz w:val="20"/>
+          <w:szCs w:val="20"/>
+        </w:rPr>
+        <w:t xml:space="preserve">'"US should kidnap him": Khawaja Asif wishes Maduro like fate on Israel PM Netanyahu, video goes viral' </w:t>
       </w:r>
       <w:r>
         <w:rPr>
@@ -1868,6 +2597,24 @@
           <w:sz w:val="20"/>
           <w:szCs w:val="20"/>
         </w:rPr>
+        <w:t xml:space="preserve">Business Today</w:t>
+      </w:r>
+      <w:r>
+        <w:rPr>
+          <w:rFonts w:ascii="Times New Roman" w:cs="Times New Roman" w:eastAsia="Times New Roman" w:hAnsi="Times New Roman"/>
+          <w:sz w:val="20"/>
+          <w:szCs w:val="20"/>
+        </w:rPr>
+        <w:t xml:space="preserve"> (10 January 2026) &lt;https://www.businesstoday.in/india/story/us-should-kidnap-him-khawaja-asif-wishes-maduro-like-fate-on-israel-pm-netanyahu-video-goes-viral-510314-2026-01-10&gt; accessed 1 October 2026; 'When Pakistan Defence Minister calls for Netanyahu's "kidnapping" like Maduro, interview cut short on Live TV' </w:t>
+      </w:r>
+      <w:r>
+        <w:rPr>
+          <w:rFonts w:ascii="Times New Roman" w:cs="Times New Roman" w:eastAsia="Times New Roman" w:hAnsi="Times New Roman"/>
+          <w:i w:val="1"/>
+          <w:iCs w:val="1"/>
+          <w:sz w:val="20"/>
+          <w:szCs w:val="20"/>
+        </w:rPr>
         <w:t xml:space="preserve">The Tribune</w:t>
       </w:r>
       <w:r>
@@ -1880,36 +2627,201 @@
       </w:r>
     </w:p>
   </w:footnote>
-  <w:footnote w:id="26">
-    <w:p>
-      <w:pPr>
-        <w:pStyle w:val="FootnoteText"/>
-      </w:pPr>
-      <w:r>
-        <w:rPr>
-          <w:rStyle w:val="FootnoteReference"/>
-          <w:rFonts w:ascii="Times New Roman" w:cs="Times New Roman" w:eastAsia="Times New Roman" w:hAnsi="Times New Roman"/>
-          <w:sz w:val="20"/>
-          <w:szCs w:val="20"/>
-          <w:vertAlign w:val="superscript"/>
-        </w:rPr>
-        <w:footnoteRef/>
-      </w:r>
-      <w:r>
-        <w:rPr>
-          <w:rFonts w:ascii="Times New Roman" w:cs="Times New Roman" w:eastAsia="Times New Roman" w:hAnsi="Times New Roman"/>
-          <w:sz w:val="20"/>
-          <w:szCs w:val="20"/>
-        </w:rPr>
-        <w:t xml:space="preserve"> </w:t>
-      </w:r>
-      <w:r>
-        <w:rPr>
-          <w:rFonts w:ascii="Times New Roman" w:cs="Times New Roman" w:eastAsia="Times New Roman" w:hAnsi="Times New Roman"/>
-          <w:sz w:val="20"/>
-          <w:szCs w:val="20"/>
-        </w:rPr>
-        <w:t xml:space="preserve">Khan (n 1); Naveed-ur-Rehman, Chaudhry and Niazi (n 1).</w:t>
+  <w:footnote w:id="39">
+    <w:p>
+      <w:pPr>
+        <w:pStyle w:val="FootnoteText"/>
+      </w:pPr>
+      <w:r>
+        <w:rPr>
+          <w:rStyle w:val="FootnoteReference"/>
+          <w:rFonts w:ascii="Times New Roman" w:cs="Times New Roman" w:eastAsia="Times New Roman" w:hAnsi="Times New Roman"/>
+          <w:sz w:val="20"/>
+          <w:szCs w:val="20"/>
+          <w:vertAlign w:val="superscript"/>
+        </w:rPr>
+        <w:footnoteRef/>
+      </w:r>
+      <w:r>
+        <w:rPr>
+          <w:rFonts w:ascii="Times New Roman" w:cs="Times New Roman" w:eastAsia="Times New Roman" w:hAnsi="Times New Roman"/>
+          <w:sz w:val="20"/>
+          <w:szCs w:val="20"/>
+        </w:rPr>
+        <w:t xml:space="preserve"> </w:t>
+      </w:r>
+      <w:r>
+        <w:rPr>
+          <w:rFonts w:ascii="Times New Roman" w:cs="Times New Roman" w:eastAsia="Times New Roman" w:hAnsi="Times New Roman"/>
+          <w:sz w:val="20"/>
+          <w:szCs w:val="20"/>
+        </w:rPr>
+        <w:t xml:space="preserve">Assembly of States Parties (n 1); Naveed-ur-Rehman, Chaudhry and Niazi (n 2).</w:t>
+      </w:r>
+    </w:p>
+  </w:footnote>
+  <w:footnote w:id="40">
+    <w:p>
+      <w:pPr>
+        <w:pStyle w:val="FootnoteText"/>
+      </w:pPr>
+      <w:r>
+        <w:rPr>
+          <w:rStyle w:val="FootnoteReference"/>
+          <w:rFonts w:ascii="Times New Roman" w:cs="Times New Roman" w:eastAsia="Times New Roman" w:hAnsi="Times New Roman"/>
+          <w:sz w:val="20"/>
+          <w:szCs w:val="20"/>
+          <w:vertAlign w:val="superscript"/>
+        </w:rPr>
+        <w:footnoteRef/>
+      </w:r>
+      <w:r>
+        <w:rPr>
+          <w:rFonts w:ascii="Times New Roman" w:cs="Times New Roman" w:eastAsia="Times New Roman" w:hAnsi="Times New Roman"/>
+          <w:sz w:val="20"/>
+          <w:szCs w:val="20"/>
+        </w:rPr>
+        <w:t xml:space="preserve"> </w:t>
+      </w:r>
+      <w:r>
+        <w:rPr>
+          <w:rFonts w:ascii="Times New Roman" w:cs="Times New Roman" w:eastAsia="Times New Roman" w:hAnsi="Times New Roman"/>
+          <w:sz w:val="20"/>
+          <w:szCs w:val="20"/>
+        </w:rPr>
+        <w:t xml:space="preserve">Naveed-ur-Rehman, Chaudhry and Niazi (n 2).</w:t>
+      </w:r>
+    </w:p>
+  </w:footnote>
+  <w:footnote w:id="41">
+    <w:p>
+      <w:pPr>
+        <w:pStyle w:val="FootnoteText"/>
+      </w:pPr>
+      <w:r>
+        <w:rPr>
+          <w:rStyle w:val="FootnoteReference"/>
+          <w:rFonts w:ascii="Times New Roman" w:cs="Times New Roman" w:eastAsia="Times New Roman" w:hAnsi="Times New Roman"/>
+          <w:sz w:val="20"/>
+          <w:szCs w:val="20"/>
+          <w:vertAlign w:val="superscript"/>
+        </w:rPr>
+        <w:footnoteRef/>
+      </w:r>
+      <w:r>
+        <w:rPr>
+          <w:rFonts w:ascii="Times New Roman" w:cs="Times New Roman" w:eastAsia="Times New Roman" w:hAnsi="Times New Roman"/>
+          <w:sz w:val="20"/>
+          <w:szCs w:val="20"/>
+        </w:rPr>
+        <w:t xml:space="preserve"> </w:t>
+      </w:r>
+      <w:r>
+        <w:rPr>
+          <w:rFonts w:ascii="Times New Roman" w:cs="Times New Roman" w:eastAsia="Times New Roman" w:hAnsi="Times New Roman"/>
+          <w:sz w:val="20"/>
+          <w:szCs w:val="20"/>
+        </w:rPr>
+        <w:t xml:space="preserve">Parliamentarians for Global Action (n 31).</w:t>
+      </w:r>
+    </w:p>
+  </w:footnote>
+  <w:footnote w:id="42">
+    <w:p>
+      <w:pPr>
+        <w:pStyle w:val="FootnoteText"/>
+      </w:pPr>
+      <w:r>
+        <w:rPr>
+          <w:rStyle w:val="FootnoteReference"/>
+          <w:rFonts w:ascii="Times New Roman" w:cs="Times New Roman" w:eastAsia="Times New Roman" w:hAnsi="Times New Roman"/>
+          <w:sz w:val="20"/>
+          <w:szCs w:val="20"/>
+          <w:vertAlign w:val="superscript"/>
+        </w:rPr>
+        <w:footnoteRef/>
+      </w:r>
+      <w:r>
+        <w:rPr>
+          <w:rFonts w:ascii="Times New Roman" w:cs="Times New Roman" w:eastAsia="Times New Roman" w:hAnsi="Times New Roman"/>
+          <w:sz w:val="20"/>
+          <w:szCs w:val="20"/>
+        </w:rPr>
+        <w:t xml:space="preserve"> </w:t>
+      </w:r>
+      <w:r>
+        <w:rPr>
+          <w:rFonts w:ascii="Times New Roman" w:cs="Times New Roman" w:eastAsia="Times New Roman" w:hAnsi="Times New Roman"/>
+          <w:sz w:val="20"/>
+          <w:szCs w:val="20"/>
+        </w:rPr>
+        <w:t xml:space="preserve">Hamdani (n 16).</w:t>
+      </w:r>
+    </w:p>
+  </w:footnote>
+  <w:footnote w:id="43">
+    <w:p>
+      <w:pPr>
+        <w:pStyle w:val="FootnoteText"/>
+      </w:pPr>
+      <w:r>
+        <w:rPr>
+          <w:rStyle w:val="FootnoteReference"/>
+          <w:rFonts w:ascii="Times New Roman" w:cs="Times New Roman" w:eastAsia="Times New Roman" w:hAnsi="Times New Roman"/>
+          <w:sz w:val="20"/>
+          <w:szCs w:val="20"/>
+          <w:vertAlign w:val="superscript"/>
+        </w:rPr>
+        <w:footnoteRef/>
+      </w:r>
+      <w:r>
+        <w:rPr>
+          <w:rFonts w:ascii="Times New Roman" w:cs="Times New Roman" w:eastAsia="Times New Roman" w:hAnsi="Times New Roman"/>
+          <w:sz w:val="20"/>
+          <w:szCs w:val="20"/>
+        </w:rPr>
+        <w:t xml:space="preserve"> </w:t>
+      </w:r>
+      <w:r>
+        <w:rPr>
+          <w:rFonts w:ascii="Times New Roman" w:cs="Times New Roman" w:eastAsia="Times New Roman" w:hAnsi="Times New Roman"/>
+          <w:sz w:val="20"/>
+          <w:szCs w:val="20"/>
+        </w:rPr>
+        <w:t xml:space="preserve">Khan (n 2); Naveed-ur-Rehman, Chaudhry and Niazi (n 2).</w:t>
+      </w:r>
+    </w:p>
+  </w:footnote>
+  <w:footnote w:id="44">
+    <w:p>
+      <w:pPr>
+        <w:pStyle w:val="FootnoteText"/>
+      </w:pPr>
+      <w:r>
+        <w:rPr>
+          <w:rStyle w:val="FootnoteReference"/>
+          <w:rFonts w:ascii="Times New Roman" w:cs="Times New Roman" w:eastAsia="Times New Roman" w:hAnsi="Times New Roman"/>
+          <w:sz w:val="20"/>
+          <w:szCs w:val="20"/>
+          <w:vertAlign w:val="superscript"/>
+        </w:rPr>
+        <w:footnoteRef/>
+      </w:r>
+      <w:r>
+        <w:rPr>
+          <w:rFonts w:ascii="Times New Roman" w:cs="Times New Roman" w:eastAsia="Times New Roman" w:hAnsi="Times New Roman"/>
+          <w:sz w:val="20"/>
+          <w:szCs w:val="20"/>
+        </w:rPr>
+        <w:t xml:space="preserve"> </w:t>
+      </w:r>
+      <w:r>
+        <w:rPr>
+          <w:rFonts w:ascii="Times New Roman" w:cs="Times New Roman" w:eastAsia="Times New Roman" w:hAnsi="Times New Roman"/>
+          <w:sz w:val="20"/>
+          <w:szCs w:val="20"/>
+        </w:rPr>
+        <w:t xml:space="preserve">See the text to nn 21 and 38.</w:t>
       </w:r>
     </w:p>
   </w:footnote>

</xml_diff>